<commit_message>
docs: align submission with implemented MVP
</commit_message>
<xml_diff>
--- a/docs/EARNSCORE_SUBMISSION.docx
+++ b/docs/EARNSCORE_SUBMISSION.docx
@@ -2,7 +2,7 @@
 <file path=word/document.xml><?xml version="1.0" encoding="utf-8"?>
 <w:document xmlns:w="http://schemas.openxmlformats.org/wordprocessingml/2006/main" xmlns:m="http://schemas.openxmlformats.org/officeDocument/2006/math" xmlns:r="http://schemas.openxmlformats.org/officeDocument/2006/relationships" xmlns:o="urn:schemas-microsoft-com:office:office" xmlns:v="urn:schemas-microsoft-com:vml" xmlns:w10="urn:schemas-microsoft-com:office:word" xmlns:a="http://schemas.openxmlformats.org/drawingml/2006/main" xmlns:pic="http://schemas.openxmlformats.org/drawingml/2006/picture" xmlns:wp="http://schemas.openxmlformats.org/drawingml/2006/wordprocessingDrawing">
   <w:body>
-    <w:bookmarkStart w:id="63" w:name="earnscore"/>
+    <w:bookmarkStart w:id="64" w:name="earnscore"/>
     <w:p>
       <w:pPr>
         <w:pStyle w:val="Heading1"/>
@@ -52,6 +52,70 @@
       </w:r>
       <w:r>
         <w:t xml:space="preserve">Alternative Credit Scoring and Financial Inclusion</w:t>
+      </w:r>
+    </w:p>
+    <w:p>
+      <w:pPr>
+        <w:pStyle w:val="BodyText"/>
+      </w:pPr>
+      <w:r>
+        <w:rPr>
+          <w:b/>
+          <w:bCs/>
+        </w:rPr>
+        <w:t xml:space="preserve">Team name:</w:t>
+      </w:r>
+      <w:r>
+        <w:t xml:space="preserve"> </w:t>
+      </w:r>
+      <w:r>
+        <w:t xml:space="preserve">Winterfell Club</w:t>
+      </w:r>
+      <w:r>
+        <w:t xml:space="preserve"> </w:t>
+      </w:r>
+      <w:r>
+        <w:rPr>
+          <w:b/>
+          <w:bCs/>
+        </w:rPr>
+        <w:t xml:space="preserve">Team members:</w:t>
+      </w:r>
+    </w:p>
+    <w:p>
+      <w:pPr>
+        <w:pStyle w:val="Compact"/>
+        <w:numPr>
+          <w:ilvl w:val="0"/>
+          <w:numId w:val="1001"/>
+        </w:numPr>
+      </w:pPr>
+      <w:r>
+        <w:t xml:space="preserve">Nikhil Upadhyay</w:t>
+      </w:r>
+    </w:p>
+    <w:p>
+      <w:pPr>
+        <w:pStyle w:val="Compact"/>
+        <w:numPr>
+          <w:ilvl w:val="0"/>
+          <w:numId w:val="1001"/>
+        </w:numPr>
+      </w:pPr>
+      <w:r>
+        <w:t xml:space="preserve">Sharath B S</w:t>
+      </w:r>
+    </w:p>
+    <w:p>
+      <w:pPr>
+        <w:pStyle w:val="Compact"/>
+        <w:numPr>
+          <w:ilvl w:val="0"/>
+          <w:numId w:val="1001"/>
+        </w:numPr>
+      </w:pPr>
+      <w:r>
+        <w:t xml:space="preserve">Shaikh Asgar</w:t>
       </w:r>
     </w:p>
     <w:p>
@@ -443,7 +507,7 @@
     </w:tbl>
     <w:bookmarkEnd w:id="27"/>
     <w:bookmarkEnd w:id="28"/>
-    <w:bookmarkStart w:id="33" w:name="X5ed607bb45a37c165afc3e191f64390c6852d57"/>
+    <w:bookmarkStart w:id="34" w:name="X5ed607bb45a37c165afc3e191f64390c6852d57"/>
     <w:p>
       <w:pPr>
         <w:pStyle w:val="Heading2"/>
@@ -474,7 +538,7 @@
         <w:pStyle w:val="Compact"/>
         <w:numPr>
           <w:ilvl w:val="0"/>
-          <w:numId w:val="1001"/>
+          <w:numId w:val="1002"/>
         </w:numPr>
       </w:pPr>
       <w:r>
@@ -496,7 +560,7 @@
         <w:pStyle w:val="Compact"/>
         <w:numPr>
           <w:ilvl w:val="0"/>
-          <w:numId w:val="1001"/>
+          <w:numId w:val="1002"/>
         </w:numPr>
       </w:pPr>
       <w:r>
@@ -518,7 +582,7 @@
         <w:pStyle w:val="Compact"/>
         <w:numPr>
           <w:ilvl w:val="0"/>
-          <w:numId w:val="1001"/>
+          <w:numId w:val="1002"/>
         </w:numPr>
       </w:pPr>
       <w:r>
@@ -540,7 +604,7 @@
         <w:pStyle w:val="Compact"/>
         <w:numPr>
           <w:ilvl w:val="0"/>
-          <w:numId w:val="1001"/>
+          <w:numId w:val="1002"/>
         </w:numPr>
       </w:pPr>
       <w:r>
@@ -562,7 +626,7 @@
         <w:pStyle w:val="Compact"/>
         <w:numPr>
           <w:ilvl w:val="0"/>
-          <w:numId w:val="1001"/>
+          <w:numId w:val="1002"/>
         </w:numPr>
       </w:pPr>
       <w:r>
@@ -576,15 +640,15 @@
         <w:t xml:space="preserve"> </w:t>
       </w:r>
       <w:r>
-        <w:t xml:space="preserve">A deterministic model starts at 300 and awards up to 600 points across six explainable factors.</w:t>
-      </w:r>
-    </w:p>
-    <w:p>
-      <w:pPr>
-        <w:pStyle w:val="Compact"/>
-        <w:numPr>
-          <w:ilvl w:val="0"/>
-          <w:numId w:val="1001"/>
+        <w:t xml:space="preserve">A deterministic model starts at 300 and awards up to 600 points across seven explainable financial features.</w:t>
+      </w:r>
+    </w:p>
+    <w:p>
+      <w:pPr>
+        <w:pStyle w:val="Compact"/>
+        <w:numPr>
+          <w:ilvl w:val="0"/>
+          <w:numId w:val="1002"/>
         </w:numPr>
       </w:pPr>
       <w:r>
@@ -598,15 +662,15 @@
         <w:t xml:space="preserve"> </w:t>
       </w:r>
       <w:r>
-        <w:t xml:space="preserve">Observation length, coverage, source verification, and transaction-classification quality produce a separate confidence value.</w:t>
-      </w:r>
-    </w:p>
-    <w:p>
-      <w:pPr>
-        <w:pStyle w:val="Compact"/>
-        <w:numPr>
-          <w:ilvl w:val="0"/>
-          <w:numId w:val="1001"/>
+        <w:t xml:space="preserve">Data coverage, transaction density, classification quality, active earning history, and feature availability produce separate evidence-quality indicators.</w:t>
+      </w:r>
+    </w:p>
+    <w:p>
+      <w:pPr>
+        <w:pStyle w:val="Compact"/>
+        <w:numPr>
+          <w:ilvl w:val="0"/>
+          <w:numId w:val="1002"/>
         </w:numPr>
       </w:pPr>
       <w:r>
@@ -628,7 +692,7 @@
         <w:pStyle w:val="Compact"/>
         <w:numPr>
           <w:ilvl w:val="0"/>
-          <w:numId w:val="1001"/>
+          <w:numId w:val="1002"/>
         </w:numPr>
       </w:pPr>
       <w:r>
@@ -653,6 +717,1421 @@
       </w:pPr>
       <w:r>
         <w:t xml:space="preserve">Explainable score design</w:t>
+      </w:r>
+    </w:p>
+    <w:tbl>
+      <w:tblPr>
+        <w:tblStyle w:val="Table"/>
+        <w:tblW w:type="auto" w:w="0"/>
+        <w:jc w:val="left"/>
+        <w:tblLook w:firstRow="1" w:lastRow="0" w:firstColumn="0" w:lastColumn="0" w:noHBand="0" w:noVBand="0" w:val="0020"/>
+      </w:tblPr>
+      <w:tblGrid>
+        <w:gridCol w:w="1980"/>
+        <w:gridCol w:w="1980"/>
+        <w:gridCol w:w="1980"/>
+        <w:gridCol w:w="1980"/>
+      </w:tblGrid>
+      <w:tr>
+        <w:trPr>
+          <w:tblHeader w:val="on"/>
+        </w:trPr>
+        <w:tc>
+          <w:tcPr/>
+          <w:p>
+            <w:pPr>
+              <w:pStyle w:val="Compact"/>
+              <w:jc w:val="left"/>
+            </w:pPr>
+            <w:r>
+              <w:t xml:space="preserve">Factor</w:t>
+            </w:r>
+          </w:p>
+        </w:tc>
+        <w:tc>
+          <w:tcPr/>
+          <w:p>
+            <w:pPr>
+              <w:pStyle w:val="Compact"/>
+              <w:jc w:val="right"/>
+            </w:pPr>
+            <w:r>
+              <w:t xml:space="preserve">Weight</w:t>
+            </w:r>
+          </w:p>
+        </w:tc>
+        <w:tc>
+          <w:tcPr/>
+          <w:p>
+            <w:pPr>
+              <w:pStyle w:val="Compact"/>
+              <w:jc w:val="right"/>
+            </w:pPr>
+            <w:r>
+              <w:t xml:space="preserve">Maximum points when all features are available</w:t>
+            </w:r>
+          </w:p>
+        </w:tc>
+        <w:tc>
+          <w:tcPr/>
+          <w:p>
+            <w:pPr>
+              <w:pStyle w:val="Compact"/>
+              <w:jc w:val="left"/>
+            </w:pPr>
+            <w:r>
+              <w:t xml:space="preserve">Financial question answered</w:t>
+            </w:r>
+          </w:p>
+        </w:tc>
+      </w:tr>
+      <w:tr>
+        <w:tc>
+          <w:tcPr/>
+          <w:p>
+            <w:pPr>
+              <w:pStyle w:val="Compact"/>
+              <w:jc w:val="left"/>
+            </w:pPr>
+            <w:r>
+              <w:t xml:space="preserve">Income consistency</w:t>
+            </w:r>
+          </w:p>
+        </w:tc>
+        <w:tc>
+          <w:tcPr/>
+          <w:p>
+            <w:pPr>
+              <w:pStyle w:val="Compact"/>
+              <w:jc w:val="right"/>
+            </w:pPr>
+            <w:r>
+              <w:t xml:space="preserve">25%</w:t>
+            </w:r>
+          </w:p>
+        </w:tc>
+        <w:tc>
+          <w:tcPr/>
+          <w:p>
+            <w:pPr>
+              <w:pStyle w:val="Compact"/>
+              <w:jc w:val="right"/>
+            </w:pPr>
+            <w:r>
+              <w:t xml:space="preserve">150</w:t>
+            </w:r>
+          </w:p>
+        </w:tc>
+        <w:tc>
+          <w:tcPr/>
+          <w:p>
+            <w:pPr>
+              <w:pStyle w:val="Compact"/>
+              <w:jc w:val="left"/>
+            </w:pPr>
+            <w:r>
+              <w:t xml:space="preserve">Does the applicant earn during most observed periods?</w:t>
+            </w:r>
+          </w:p>
+        </w:tc>
+      </w:tr>
+      <w:tr>
+        <w:tc>
+          <w:tcPr/>
+          <w:p>
+            <w:pPr>
+              <w:pStyle w:val="Compact"/>
+              <w:jc w:val="left"/>
+            </w:pPr>
+            <w:r>
+              <w:t xml:space="preserve">Income stability</w:t>
+            </w:r>
+          </w:p>
+        </w:tc>
+        <w:tc>
+          <w:tcPr/>
+          <w:p>
+            <w:pPr>
+              <w:pStyle w:val="Compact"/>
+              <w:jc w:val="right"/>
+            </w:pPr>
+            <w:r>
+              <w:t xml:space="preserve">20%</w:t>
+            </w:r>
+          </w:p>
+        </w:tc>
+        <w:tc>
+          <w:tcPr/>
+          <w:p>
+            <w:pPr>
+              <w:pStyle w:val="Compact"/>
+              <w:jc w:val="right"/>
+            </w:pPr>
+            <w:r>
+              <w:t xml:space="preserve">120</w:t>
+            </w:r>
+          </w:p>
+        </w:tc>
+        <w:tc>
+          <w:tcPr/>
+          <w:p>
+            <w:pPr>
+              <w:pStyle w:val="Compact"/>
+              <w:jc w:val="left"/>
+            </w:pPr>
+            <w:r>
+              <w:t xml:space="preserve">How much does income fluctuate between months?</w:t>
+            </w:r>
+          </w:p>
+        </w:tc>
+      </w:tr>
+      <w:tr>
+        <w:tc>
+          <w:tcPr/>
+          <w:p>
+            <w:pPr>
+              <w:pStyle w:val="Compact"/>
+              <w:jc w:val="left"/>
+            </w:pPr>
+            <w:r>
+              <w:t xml:space="preserve">Positive cash-flow months</w:t>
+            </w:r>
+          </w:p>
+        </w:tc>
+        <w:tc>
+          <w:tcPr/>
+          <w:p>
+            <w:pPr>
+              <w:pStyle w:val="Compact"/>
+              <w:jc w:val="right"/>
+            </w:pPr>
+            <w:r>
+              <w:t xml:space="preserve">20%</w:t>
+            </w:r>
+          </w:p>
+        </w:tc>
+        <w:tc>
+          <w:tcPr/>
+          <w:p>
+            <w:pPr>
+              <w:pStyle w:val="Compact"/>
+              <w:jc w:val="right"/>
+            </w:pPr>
+            <w:r>
+              <w:t xml:space="preserve">120</w:t>
+            </w:r>
+          </w:p>
+        </w:tc>
+        <w:tc>
+          <w:tcPr/>
+          <w:p>
+            <w:pPr>
+              <w:pStyle w:val="Compact"/>
+              <w:jc w:val="left"/>
+            </w:pPr>
+            <w:r>
+              <w:t xml:space="preserve">How often does observed income exceed expenses?</w:t>
+            </w:r>
+          </w:p>
+        </w:tc>
+      </w:tr>
+      <w:tr>
+        <w:tc>
+          <w:tcPr/>
+          <w:p>
+            <w:pPr>
+              <w:pStyle w:val="Compact"/>
+              <w:jc w:val="left"/>
+            </w:pPr>
+            <w:r>
+              <w:t xml:space="preserve">Expense management</w:t>
+            </w:r>
+          </w:p>
+        </w:tc>
+        <w:tc>
+          <w:tcPr/>
+          <w:p>
+            <w:pPr>
+              <w:pStyle w:val="Compact"/>
+              <w:jc w:val="right"/>
+            </w:pPr>
+            <w:r>
+              <w:t xml:space="preserve">15%</w:t>
+            </w:r>
+          </w:p>
+        </w:tc>
+        <w:tc>
+          <w:tcPr/>
+          <w:p>
+            <w:pPr>
+              <w:pStyle w:val="Compact"/>
+              <w:jc w:val="right"/>
+            </w:pPr>
+            <w:r>
+              <w:t xml:space="preserve">90</w:t>
+            </w:r>
+          </w:p>
+        </w:tc>
+        <w:tc>
+          <w:tcPr/>
+          <w:p>
+            <w:pPr>
+              <w:pStyle w:val="Compact"/>
+              <w:jc w:val="left"/>
+            </w:pPr>
+            <w:r>
+              <w:t xml:space="preserve">Is the expense-to-income ratio sustainable?</w:t>
+            </w:r>
+          </w:p>
+        </w:tc>
+      </w:tr>
+      <w:tr>
+        <w:tc>
+          <w:tcPr/>
+          <w:p>
+            <w:pPr>
+              <w:pStyle w:val="Compact"/>
+              <w:jc w:val="left"/>
+            </w:pPr>
+            <w:r>
+              <w:t xml:space="preserve">Income trend</w:t>
+            </w:r>
+          </w:p>
+        </w:tc>
+        <w:tc>
+          <w:tcPr/>
+          <w:p>
+            <w:pPr>
+              <w:pStyle w:val="Compact"/>
+              <w:jc w:val="right"/>
+            </w:pPr>
+            <w:r>
+              <w:t xml:space="preserve">10%</w:t>
+            </w:r>
+          </w:p>
+        </w:tc>
+        <w:tc>
+          <w:tcPr/>
+          <w:p>
+            <w:pPr>
+              <w:pStyle w:val="Compact"/>
+              <w:jc w:val="right"/>
+            </w:pPr>
+            <w:r>
+              <w:t xml:space="preserve">60</w:t>
+            </w:r>
+          </w:p>
+        </w:tc>
+        <w:tc>
+          <w:tcPr/>
+          <w:p>
+            <w:pPr>
+              <w:pStyle w:val="Compact"/>
+              <w:jc w:val="left"/>
+            </w:pPr>
+            <w:r>
+              <w:t xml:space="preserve">Is recent earning capacity stable or improving?</w:t>
+            </w:r>
+          </w:p>
+        </w:tc>
+      </w:tr>
+      <w:tr>
+        <w:tc>
+          <w:tcPr/>
+          <w:p>
+            <w:pPr>
+              <w:pStyle w:val="Compact"/>
+              <w:jc w:val="left"/>
+            </w:pPr>
+            <w:r>
+              <w:t xml:space="preserve">Emergency savings buffer</w:t>
+            </w:r>
+          </w:p>
+        </w:tc>
+        <w:tc>
+          <w:tcPr/>
+          <w:p>
+            <w:pPr>
+              <w:pStyle w:val="Compact"/>
+              <w:jc w:val="right"/>
+            </w:pPr>
+            <w:r>
+              <w:t xml:space="preserve">5%</w:t>
+            </w:r>
+          </w:p>
+        </w:tc>
+        <w:tc>
+          <w:tcPr/>
+          <w:p>
+            <w:pPr>
+              <w:pStyle w:val="Compact"/>
+              <w:jc w:val="right"/>
+            </w:pPr>
+            <w:r>
+              <w:t xml:space="preserve">30</w:t>
+            </w:r>
+          </w:p>
+        </w:tc>
+        <w:tc>
+          <w:tcPr/>
+          <w:p>
+            <w:pPr>
+              <w:pStyle w:val="Compact"/>
+              <w:jc w:val="left"/>
+            </w:pPr>
+            <w:r>
+              <w:t xml:space="preserve">Is there a visible cushion against short interruptions?</w:t>
+            </w:r>
+          </w:p>
+        </w:tc>
+      </w:tr>
+      <w:tr>
+        <w:tc>
+          <w:tcPr/>
+          <w:p>
+            <w:pPr>
+              <w:pStyle w:val="Compact"/>
+              <w:jc w:val="left"/>
+            </w:pPr>
+            <w:r>
+              <w:t xml:space="preserve">Income-source diversity</w:t>
+            </w:r>
+          </w:p>
+        </w:tc>
+        <w:tc>
+          <w:tcPr/>
+          <w:p>
+            <w:pPr>
+              <w:pStyle w:val="Compact"/>
+              <w:jc w:val="right"/>
+            </w:pPr>
+            <w:r>
+              <w:t xml:space="preserve">5%</w:t>
+            </w:r>
+          </w:p>
+        </w:tc>
+        <w:tc>
+          <w:tcPr/>
+          <w:p>
+            <w:pPr>
+              <w:pStyle w:val="Compact"/>
+              <w:jc w:val="right"/>
+            </w:pPr>
+            <w:r>
+              <w:t xml:space="preserve">30</w:t>
+            </w:r>
+          </w:p>
+        </w:tc>
+        <w:tc>
+          <w:tcPr/>
+          <w:p>
+            <w:pPr>
+              <w:pStyle w:val="Compact"/>
+              <w:jc w:val="left"/>
+            </w:pPr>
+            <w:r>
+              <w:t xml:space="preserve">Is income overly dependent on one source?</w:t>
+            </w:r>
+          </w:p>
+        </w:tc>
+      </w:tr>
+    </w:tbl>
+    <w:p>
+      <w:pPr>
+        <w:pStyle w:val="BodyText"/>
+      </w:pPr>
+      <w:r>
+        <w:t xml:space="preserve">If a feature such as running-balance-based buffer days is genuinely unavailable, its weight is excluded and the 600 variable points are proportionally allocated across the available factors. Feature completeness remains visible to the reviewer instead of silently treating missing data as good or bad behavior.</w:t>
+      </w:r>
+    </w:p>
+    <w:p>
+      <w:pPr>
+        <w:pStyle w:val="BodyText"/>
+      </w:pPr>
+      <w:r>
+        <w:t xml:space="preserve">The result is clamped between 300 and 900. Suggested interpretation bands are:</w:t>
+      </w:r>
+    </w:p>
+    <w:p>
+      <w:pPr>
+        <w:pStyle w:val="Compact"/>
+        <w:numPr>
+          <w:ilvl w:val="0"/>
+          <w:numId w:val="1003"/>
+        </w:numPr>
+      </w:pPr>
+      <w:r>
+        <w:rPr>
+          <w:b/>
+          <w:bCs/>
+        </w:rPr>
+        <w:t xml:space="preserve">750–900 — Strong:</w:t>
+      </w:r>
+      <w:r>
+        <w:t xml:space="preserve"> </w:t>
+      </w:r>
+      <w:r>
+        <w:t xml:space="preserve">consistent and resilient observed earning pattern</w:t>
+      </w:r>
+    </w:p>
+    <w:p>
+      <w:pPr>
+        <w:pStyle w:val="Compact"/>
+        <w:numPr>
+          <w:ilvl w:val="0"/>
+          <w:numId w:val="1003"/>
+        </w:numPr>
+      </w:pPr>
+      <w:r>
+        <w:rPr>
+          <w:b/>
+          <w:bCs/>
+        </w:rPr>
+        <w:t xml:space="preserve">600–749 — Moderate:</w:t>
+      </w:r>
+      <w:r>
+        <w:t xml:space="preserve"> </w:t>
+      </w:r>
+      <w:r>
+        <w:t xml:space="preserve">useful earning evidence with some volatility or concerns</w:t>
+      </w:r>
+    </w:p>
+    <w:p>
+      <w:pPr>
+        <w:pStyle w:val="Compact"/>
+        <w:numPr>
+          <w:ilvl w:val="0"/>
+          <w:numId w:val="1003"/>
+        </w:numPr>
+      </w:pPr>
+      <w:r>
+        <w:rPr>
+          <w:b/>
+          <w:bCs/>
+        </w:rPr>
+        <w:t xml:space="preserve">300–599 — Needs Review:</w:t>
+      </w:r>
+      <w:r>
+        <w:t xml:space="preserve"> </w:t>
+      </w:r>
+      <w:r>
+        <w:t xml:space="preserve">limited evidence or material instability requiring closer review</w:t>
+      </w:r>
+    </w:p>
+    <w:p>
+      <w:pPr>
+        <w:pStyle w:val="FirstParagraph"/>
+      </w:pPr>
+      <w:r>
+        <w:t xml:space="preserve">These bands describe observed financial behavior. They do not claim a validated probability of default. Production use would require lender-specific outcome data, calibration, bias testing, regulatory review, and continuous monitoring.</w:t>
+      </w:r>
+    </w:p>
+    <w:bookmarkEnd w:id="30"/>
+    <w:bookmarkStart w:id="31" w:name="mvp-architecture"/>
+    <w:p>
+      <w:pPr>
+        <w:pStyle w:val="Heading3"/>
+      </w:pPr>
+      <w:r>
+        <w:t xml:space="preserve">MVP architecture</w:t>
+      </w:r>
+    </w:p>
+    <w:p>
+      <w:pPr>
+        <w:pStyle w:val="SourceCode"/>
+      </w:pPr>
+      <w:r>
+        <w:rPr>
+          <w:rStyle w:val="VerbatimChar"/>
+        </w:rPr>
+        <w:t xml:space="preserve">CSV / simulated gig records</w:t>
+      </w:r>
+      <w:r>
+        <w:br/>
+      </w:r>
+      <w:r>
+        <w:rPr>
+          <w:rStyle w:val="VerbatimChar"/>
+        </w:rPr>
+        <w:t xml:space="preserve">            |</w:t>
+      </w:r>
+      <w:r>
+        <w:br/>
+      </w:r>
+      <w:r>
+        <w:rPr>
+          <w:rStyle w:val="VerbatimChar"/>
+        </w:rPr>
+        <w:t xml:space="preserve">            v</w:t>
+      </w:r>
+      <w:r>
+        <w:br/>
+      </w:r>
+      <w:r>
+        <w:rPr>
+          <w:rStyle w:val="VerbatimChar"/>
+        </w:rPr>
+        <w:t xml:space="preserve">Ingestion and normalization pipeline</w:t>
+      </w:r>
+      <w:r>
+        <w:br/>
+      </w:r>
+      <w:r>
+        <w:rPr>
+          <w:rStyle w:val="VerbatimChar"/>
+        </w:rPr>
+        <w:t xml:space="preserve">            |</w:t>
+      </w:r>
+      <w:r>
+        <w:br/>
+      </w:r>
+      <w:r>
+        <w:rPr>
+          <w:rStyle w:val="VerbatimChar"/>
+        </w:rPr>
+        <w:t xml:space="preserve">            v</w:t>
+      </w:r>
+      <w:r>
+        <w:br/>
+      </w:r>
+      <w:r>
+        <w:rPr>
+          <w:rStyle w:val="VerbatimChar"/>
+        </w:rPr>
+        <w:t xml:space="preserve">Feature extraction and data-quality checks</w:t>
+      </w:r>
+      <w:r>
+        <w:br/>
+      </w:r>
+      <w:r>
+        <w:rPr>
+          <w:rStyle w:val="VerbatimChar"/>
+        </w:rPr>
+        <w:t xml:space="preserve">            |</w:t>
+      </w:r>
+      <w:r>
+        <w:br/>
+      </w:r>
+      <w:r>
+        <w:rPr>
+          <w:rStyle w:val="VerbatimChar"/>
+        </w:rPr>
+        <w:t xml:space="preserve">            v</w:t>
+      </w:r>
+      <w:r>
+        <w:br/>
+      </w:r>
+      <w:r>
+        <w:rPr>
+          <w:rStyle w:val="VerbatimChar"/>
+        </w:rPr>
+        <w:t xml:space="preserve">Explainable scoring API + confidence engine</w:t>
+      </w:r>
+      <w:r>
+        <w:br/>
+      </w:r>
+      <w:r>
+        <w:rPr>
+          <w:rStyle w:val="VerbatimChar"/>
+        </w:rPr>
+        <w:t xml:space="preserve">            |</w:t>
+      </w:r>
+      <w:r>
+        <w:br/>
+      </w:r>
+      <w:r>
+        <w:rPr>
+          <w:rStyle w:val="VerbatimChar"/>
+        </w:rPr>
+        <w:t xml:space="preserve">            v</w:t>
+      </w:r>
+      <w:r>
+        <w:br/>
+      </w:r>
+      <w:r>
+        <w:rPr>
+          <w:rStyle w:val="VerbatimChar"/>
+        </w:rPr>
+        <w:t xml:space="preserve">Lender dashboard, evidence view, and human review</w:t>
+      </w:r>
+    </w:p>
+    <w:p>
+      <w:pPr>
+        <w:pStyle w:val="FirstParagraph"/>
+      </w:pPr>
+      <w:r>
+        <w:t xml:space="preserve">The hackathon implementation uses React, Vite, JavaScript, and responsive CSS for the dashboard, with Python, FastAPI, Pydantic, pandas, and NumPy for the data and scoring services. Reproducible CSV fixtures provide demonstration data without requiring access to real financial information.</w:t>
+      </w:r>
+    </w:p>
+    <w:bookmarkEnd w:id="31"/>
+    <w:bookmarkStart w:id="32" w:name="implemented-mvp"/>
+    <w:p>
+      <w:pPr>
+        <w:pStyle w:val="Heading3"/>
+      </w:pPr>
+      <w:r>
+        <w:t xml:space="preserve">Implemented MVP</w:t>
+      </w:r>
+    </w:p>
+    <w:p>
+      <w:pPr>
+        <w:pStyle w:val="FirstParagraph"/>
+      </w:pPr>
+      <w:r>
+        <w:t xml:space="preserve">The three development branches already contain the following working components:</w:t>
+      </w:r>
+    </w:p>
+    <w:p>
+      <w:pPr>
+        <w:pStyle w:val="Compact"/>
+        <w:numPr>
+          <w:ilvl w:val="0"/>
+          <w:numId w:val="1004"/>
+        </w:numPr>
+      </w:pPr>
+      <w:r>
+        <w:rPr>
+          <w:b/>
+          <w:bCs/>
+        </w:rPr>
+        <w:t xml:space="preserve">Data pipeline:</w:t>
+      </w:r>
+      <w:r>
+        <w:t xml:space="preserve"> </w:t>
+      </w:r>
+      <w:r>
+        <w:t xml:space="preserve">Three reproducible personas—stable, volatile, and seasonal—plus schema validation, transaction classification, exact-duplicate removal, conflicting-record quarantine, refund and transfer handling, monthly aggregation, seven financial features, and a command-line CSV-to-JSON workflow.</w:t>
+      </w:r>
+    </w:p>
+    <w:p>
+      <w:pPr>
+        <w:pStyle w:val="Compact"/>
+        <w:numPr>
+          <w:ilvl w:val="0"/>
+          <w:numId w:val="1004"/>
+        </w:numPr>
+      </w:pPr>
+      <w:r>
+        <w:rPr>
+          <w:b/>
+          <w:bCs/>
+        </w:rPr>
+        <w:t xml:space="preserve">Data-quality engine:</w:t>
+      </w:r>
+      <w:r>
+        <w:t xml:space="preserve"> </w:t>
+      </w:r>
+      <w:r>
+        <w:t xml:space="preserve">Measures observed and missing months, transaction count, unclassified ratio, and evidence confidence. Its deterministic confidence formula considers coverage, transaction density, classification quality, and active earning history.</w:t>
+      </w:r>
+    </w:p>
+    <w:p>
+      <w:pPr>
+        <w:pStyle w:val="Compact"/>
+        <w:numPr>
+          <w:ilvl w:val="0"/>
+          <w:numId w:val="1004"/>
+        </w:numPr>
+      </w:pPr>
+      <w:r>
+        <w:rPr>
+          <w:b/>
+          <w:bCs/>
+        </w:rPr>
+        <w:t xml:space="preserve">Scoring API:</w:t>
+      </w:r>
+      <w:r>
+        <w:t xml:space="preserve"> </w:t>
+      </w:r>
+      <w:r>
+        <w:t xml:space="preserve">A FastAPI service with health and scoring endpoints, strict request validation, deterministic 300–900 scoring, factor-level points, readable explanations, evidence values, score bands, and risk flags for volatility, high expenses, irregular activity, and unavailable buffer data.</w:t>
+      </w:r>
+    </w:p>
+    <w:p>
+      <w:pPr>
+        <w:pStyle w:val="Compact"/>
+        <w:numPr>
+          <w:ilvl w:val="0"/>
+          <w:numId w:val="1004"/>
+        </w:numPr>
+      </w:pPr>
+      <w:r>
+        <w:rPr>
+          <w:b/>
+          <w:bCs/>
+        </w:rPr>
+        <w:t xml:space="preserve">Lender dashboard:</w:t>
+      </w:r>
+      <w:r>
+        <w:t xml:space="preserve"> </w:t>
+      </w:r>
+      <w:r>
+        <w:t xml:space="preserve">A responsive React interface connected to the scoring API, including an assessment form, score gauge, factor bars, data-quality indicators, risk flags, filtering controls, API status handling, and a human-review panel.</w:t>
+      </w:r>
+    </w:p>
+    <w:p>
+      <w:pPr>
+        <w:pStyle w:val="Compact"/>
+        <w:numPr>
+          <w:ilvl w:val="0"/>
+          <w:numId w:val="1004"/>
+        </w:numPr>
+      </w:pPr>
+      <w:r>
+        <w:rPr>
+          <w:b/>
+          <w:bCs/>
+        </w:rPr>
+        <w:t xml:space="preserve">Automated validation:</w:t>
+      </w:r>
+      <w:r>
+        <w:t xml:space="preserve"> </w:t>
+      </w:r>
+      <w:r>
+        <w:t xml:space="preserve">Unit and integration tests cover generation, schemas, cleaning, feature extraction, command-line execution, scoring boundaries, missing features, API validation, and all three personas.</w:t>
+      </w:r>
+    </w:p>
+    <w:p>
+      <w:pPr>
+        <w:pStyle w:val="FirstParagraph"/>
+      </w:pPr>
+      <w:r>
+        <w:t xml:space="preserve">The human-review panel records the review locally in the current MVP. Persistent review storage and production identity controls are planned after the hackathon demonstration.</w:t>
+      </w:r>
+    </w:p>
+    <w:bookmarkEnd w:id="32"/>
+    <w:bookmarkStart w:id="33" w:name="demonstration-scenarios"/>
+    <w:p>
+      <w:pPr>
+        <w:pStyle w:val="Heading3"/>
+      </w:pPr>
+      <w:r>
+        <w:t xml:space="preserve">Demonstration scenarios</w:t>
+      </w:r>
+    </w:p>
+    <w:p>
+      <w:pPr>
+        <w:pStyle w:val="Compact"/>
+        <w:numPr>
+          <w:ilvl w:val="0"/>
+          <w:numId w:val="1005"/>
+        </w:numPr>
+      </w:pPr>
+      <w:r>
+        <w:rPr>
+          <w:b/>
+          <w:bCs/>
+        </w:rPr>
+        <w:t xml:space="preserve">Stable multi-platform worker:</w:t>
+      </w:r>
+      <w:r>
+        <w:t xml:space="preserve"> </w:t>
+      </w:r>
+      <w:r>
+        <w:t xml:space="preserve">moderate income, regular earnings, multiple sources, and healthy cash flow.</w:t>
+      </w:r>
+    </w:p>
+    <w:p>
+      <w:pPr>
+        <w:pStyle w:val="Compact"/>
+        <w:numPr>
+          <w:ilvl w:val="0"/>
+          <w:numId w:val="1005"/>
+        </w:numPr>
+      </w:pPr>
+      <w:r>
+        <w:rPr>
+          <w:b/>
+          <w:bCs/>
+        </w:rPr>
+        <w:t xml:space="preserve">High-income but volatile worker:</w:t>
+      </w:r>
+      <w:r>
+        <w:t xml:space="preserve"> </w:t>
+      </w:r>
+      <w:r>
+        <w:t xml:space="preserve">higher total income with long gaps and concentrated payments.</w:t>
+      </w:r>
+    </w:p>
+    <w:p>
+      <w:pPr>
+        <w:pStyle w:val="Compact"/>
+        <w:numPr>
+          <w:ilvl w:val="0"/>
+          <w:numId w:val="1005"/>
+        </w:numPr>
+      </w:pPr>
+      <w:r>
+        <w:rPr>
+          <w:b/>
+          <w:bCs/>
+        </w:rPr>
+        <w:t xml:space="preserve">New or seasonal worker:</w:t>
+      </w:r>
+      <w:r>
+        <w:t xml:space="preserve"> </w:t>
+      </w:r>
+      <w:r>
+        <w:t xml:space="preserve">valid earnings but limited history, producing lower confidence and a request for more information.</w:t>
+      </w:r>
+    </w:p>
+    <w:p>
+      <w:pPr>
+        <w:pStyle w:val="FirstParagraph"/>
+      </w:pPr>
+      <w:r>
+        <w:t xml:space="preserve">These scenarios demonstrate that EarnScore rewards the quality and resilience of earning patterns rather than simply favoring the applicant with the highest income.</w:t>
+      </w:r>
+    </w:p>
+    <w:bookmarkEnd w:id="33"/>
+    <w:bookmarkEnd w:id="34"/>
+    <w:bookmarkStart w:id="40" w:name="X843d442355a0d838ec32fb9e05b3f4dd6cf9a41"/>
+    <w:p>
+      <w:pPr>
+        <w:pStyle w:val="Heading2"/>
+      </w:pPr>
+      <w:r>
+        <w:t xml:space="preserve">4. Novelty</w:t>
+      </w:r>
+    </w:p>
+    <w:bookmarkStart w:id="35" w:name="X9c1fef61d3d775d48f112abf9a7c150d28e1a9f"/>
+    <w:p>
+      <w:pPr>
+        <w:pStyle w:val="Heading3"/>
+      </w:pPr>
+      <w:r>
+        <w:t xml:space="preserve">A unified earning identity instead of a salary substitute</w:t>
+      </w:r>
+    </w:p>
+    <w:p>
+      <w:pPr>
+        <w:pStyle w:val="FirstParagraph"/>
+      </w:pPr>
+      <w:r>
+        <w:t xml:space="preserve">EarnScore does more than estimate a monthly salary from bank credits. It constructs a consolidated earning profile from several fragmented sources and evaluates how those sources behave together over time.</w:t>
+      </w:r>
+    </w:p>
+    <w:bookmarkEnd w:id="35"/>
+    <w:bookmarkStart w:id="36" w:name="X5b5c3bf13567c2c6629882f5bd6b439fa840dc7"/>
+    <w:p>
+      <w:pPr>
+        <w:pStyle w:val="Heading3"/>
+      </w:pPr>
+      <w:r>
+        <w:t xml:space="preserve">Score and confidence are intentionally separate</w:t>
+      </w:r>
+    </w:p>
+    <w:p>
+      <w:pPr>
+        <w:pStyle w:val="FirstParagraph"/>
+      </w:pPr>
+      <w:r>
+        <w:t xml:space="preserve">Many scoring interfaces present a single authoritative number. EarnScore presents both the financial assessment and the strength of the underlying evidence. A promising pattern supported by incomplete data remains visible, but the system clearly asks the lender for more information.</w:t>
+      </w:r>
+    </w:p>
+    <w:bookmarkEnd w:id="36"/>
+    <w:bookmarkStart w:id="37" w:name="every-factor-is-evidence-backed"/>
+    <w:p>
+      <w:pPr>
+        <w:pStyle w:val="Heading3"/>
+      </w:pPr>
+      <w:r>
+        <w:t xml:space="preserve">Every factor is evidence-backed</w:t>
+      </w:r>
+    </w:p>
+    <w:p>
+      <w:pPr>
+        <w:pStyle w:val="FirstParagraph"/>
+      </w:pPr>
+      <w:r>
+        <w:t xml:space="preserve">A lender can open a factor, read its plain-language explanation, and inspect the values that produced its points. For example, income-consistency points can show that earnings were observed in 11 of 12 months. This makes the result easier to challenge, audit, and explain to an applicant.</w:t>
+      </w:r>
+    </w:p>
+    <w:bookmarkEnd w:id="37"/>
+    <w:bookmarkStart w:id="38" w:name="stability-can-outweigh-absolute-income"/>
+    <w:p>
+      <w:pPr>
+        <w:pStyle w:val="Heading3"/>
+      </w:pPr>
+      <w:r>
+        <w:t xml:space="preserve">Stability can outweigh absolute income</w:t>
+      </w:r>
+    </w:p>
+    <w:p>
+      <w:pPr>
+        <w:pStyle w:val="FirstParagraph"/>
+      </w:pPr>
+      <w:r>
+        <w:t xml:space="preserve">The design deliberately allows a lower-income but consistent worker to score better than a higher-income worker with extreme volatility. This aligns the assessment with sustainable repayment capacity and makes the system relevant to gig work rather than reproducing salary-based ranking.</w:t>
+      </w:r>
+    </w:p>
+    <w:bookmarkEnd w:id="38"/>
+    <w:bookmarkStart w:id="39" w:name="Xf00f8888577fa2084763d13a847498ce9d39e43"/>
+    <w:p>
+      <w:pPr>
+        <w:pStyle w:val="Heading3"/>
+      </w:pPr>
+      <w:r>
+        <w:t xml:space="preserve">Human judgment is part of the product flow</w:t>
+      </w:r>
+    </w:p>
+    <w:p>
+      <w:pPr>
+        <w:pStyle w:val="FirstParagraph"/>
+      </w:pPr>
+      <w:r>
+        <w:t xml:space="preserve">EarnScore records the lender's review separately from the calculated score. It supports structured decision-making while preventing the score from being presented as an automatic approval or rejection engine.</w:t>
+      </w:r>
+    </w:p>
+    <w:bookmarkEnd w:id="39"/>
+    <w:bookmarkEnd w:id="40"/>
+    <w:bookmarkStart w:id="44" w:name="Xad882fcfee705624e0d53244a75e0f93b33b53d"/>
+    <w:p>
+      <w:pPr>
+        <w:pStyle w:val="Heading2"/>
+      </w:pPr>
+      <w:r>
+        <w:t xml:space="preserve">5. Innovation</w:t>
+      </w:r>
+    </w:p>
+    <w:bookmarkStart w:id="41" w:name="technical-innovation"/>
+    <w:p>
+      <w:pPr>
+        <w:pStyle w:val="Heading3"/>
+      </w:pPr>
+      <w:r>
+        <w:t xml:space="preserve">Technical innovation</w:t>
+      </w:r>
+    </w:p>
+    <w:p>
+      <w:pPr>
+        <w:pStyle w:val="Compact"/>
+        <w:numPr>
+          <w:ilvl w:val="0"/>
+          <w:numId w:val="1006"/>
+        </w:numPr>
+      </w:pPr>
+      <w:r>
+        <w:rPr>
+          <w:b/>
+          <w:bCs/>
+        </w:rPr>
+        <w:t xml:space="preserve">Multi-source normalization:</w:t>
+      </w:r>
+      <w:r>
+        <w:t xml:space="preserve"> </w:t>
+      </w:r>
+      <w:r>
+        <w:t xml:space="preserve">Converts different platform and account formats into one auditable transaction timeline.</w:t>
+      </w:r>
+    </w:p>
+    <w:p>
+      <w:pPr>
+        <w:pStyle w:val="Compact"/>
+        <w:numPr>
+          <w:ilvl w:val="0"/>
+          <w:numId w:val="1006"/>
+        </w:numPr>
+      </w:pPr>
+      <w:r>
+        <w:rPr>
+          <w:b/>
+          <w:bCs/>
+        </w:rPr>
+        <w:t xml:space="preserve">Transfer and reversal handling:</w:t>
+      </w:r>
+      <w:r>
+        <w:t xml:space="preserve"> </w:t>
+      </w:r>
+      <w:r>
+        <w:t xml:space="preserve">Reduces false income inflation by identifying duplicates, refunds, reversals, and transfers between an applicant's own accounts.</w:t>
+      </w:r>
+    </w:p>
+    <w:p>
+      <w:pPr>
+        <w:pStyle w:val="Compact"/>
+        <w:numPr>
+          <w:ilvl w:val="0"/>
+          <w:numId w:val="1006"/>
+        </w:numPr>
+      </w:pPr>
+      <w:r>
+        <w:rPr>
+          <w:b/>
+          <w:bCs/>
+        </w:rPr>
+        <w:t xml:space="preserve">Resilience features:</w:t>
+      </w:r>
+      <w:r>
+        <w:t xml:space="preserve"> </w:t>
+      </w:r>
+      <w:r>
+        <w:t xml:space="preserve">Measures source concentration, positive-cash-flow frequency, income gaps, volatility, trends, and buffer days rather than relying on one aggregate income figure.</w:t>
+      </w:r>
+    </w:p>
+    <w:p>
+      <w:pPr>
+        <w:pStyle w:val="Compact"/>
+        <w:numPr>
+          <w:ilvl w:val="0"/>
+          <w:numId w:val="1006"/>
+        </w:numPr>
+      </w:pPr>
+      <w:r>
+        <w:rPr>
+          <w:b/>
+          <w:bCs/>
+        </w:rPr>
+        <w:t xml:space="preserve">Confidence engine:</w:t>
+      </w:r>
+      <w:r>
+        <w:t xml:space="preserve"> </w:t>
+      </w:r>
+      <w:r>
+        <w:t xml:space="preserve">Changes certainty based on data completeness and quality instead of hiding missing evidence inside the score.</w:t>
+      </w:r>
+    </w:p>
+    <w:p>
+      <w:pPr>
+        <w:pStyle w:val="Compact"/>
+        <w:numPr>
+          <w:ilvl w:val="0"/>
+          <w:numId w:val="1006"/>
+        </w:numPr>
+      </w:pPr>
+      <w:r>
+        <w:rPr>
+          <w:b/>
+          <w:bCs/>
+        </w:rPr>
+        <w:t xml:space="preserve">Local demo mode:</w:t>
+      </w:r>
+      <w:r>
+        <w:t xml:space="preserve"> </w:t>
+      </w:r>
+      <w:r>
+        <w:t xml:space="preserve">Uses reproducible fixtures so the full product remains demonstrable without live bank integrations or network access.</w:t>
+      </w:r>
+    </w:p>
+    <w:bookmarkEnd w:id="41"/>
+    <w:bookmarkStart w:id="42" w:name="product-innovation"/>
+    <w:p>
+      <w:pPr>
+        <w:pStyle w:val="Heading3"/>
+      </w:pPr>
+      <w:r>
+        <w:t xml:space="preserve">Product innovation</w:t>
+      </w:r>
+    </w:p>
+    <w:p>
+      <w:pPr>
+        <w:pStyle w:val="Compact"/>
+        <w:numPr>
+          <w:ilvl w:val="0"/>
+          <w:numId w:val="1007"/>
+        </w:numPr>
+      </w:pPr>
+      <w:r>
+        <w:rPr>
+          <w:b/>
+          <w:bCs/>
+        </w:rPr>
+        <w:t xml:space="preserve">Raw-to-understood transformation:</w:t>
+      </w:r>
+      <w:r>
+        <w:t xml:space="preserve"> </w:t>
+      </w:r>
+      <w:r>
+        <w:t xml:space="preserve">The dashboard visually shows how scattered payments become a coherent earning profile.</w:t>
+      </w:r>
+    </w:p>
+    <w:p>
+      <w:pPr>
+        <w:pStyle w:val="Compact"/>
+        <w:numPr>
+          <w:ilvl w:val="0"/>
+          <w:numId w:val="1007"/>
+        </w:numPr>
+      </w:pPr>
+      <w:r>
+        <w:rPr>
+          <w:b/>
+          <w:bCs/>
+        </w:rPr>
+        <w:t xml:space="preserve">Counterfactual comparison:</w:t>
+      </w:r>
+      <w:r>
+        <w:t xml:space="preserve"> </w:t>
+      </w:r>
+      <w:r>
+        <w:t xml:space="preserve">Judges and lenders can compare a stable moderate-income profile with a volatile high-income profile to understand the model's priorities.</w:t>
+      </w:r>
+    </w:p>
+    <w:p>
+      <w:pPr>
+        <w:pStyle w:val="Compact"/>
+        <w:numPr>
+          <w:ilvl w:val="0"/>
+          <w:numId w:val="1007"/>
+        </w:numPr>
+      </w:pPr>
+      <w:r>
+        <w:rPr>
+          <w:b/>
+          <w:bCs/>
+        </w:rPr>
+        <w:t xml:space="preserve">Explainable risk flags:</w:t>
+      </w:r>
+      <w:r>
+        <w:t xml:space="preserve"> </w:t>
+      </w:r>
+      <w:r>
+        <w:t xml:space="preserve">The product highlights income gaps, source dependence, negative cash-flow periods, sparse history, and classification uncertainty with supporting data.</w:t>
+      </w:r>
+    </w:p>
+    <w:p>
+      <w:pPr>
+        <w:pStyle w:val="Compact"/>
+        <w:numPr>
+          <w:ilvl w:val="0"/>
+          <w:numId w:val="1007"/>
+        </w:numPr>
+      </w:pPr>
+      <w:r>
+        <w:rPr>
+          <w:b/>
+          <w:bCs/>
+        </w:rPr>
+        <w:t xml:space="preserve">Reviewable decision trail:</w:t>
+      </w:r>
+      <w:r>
+        <w:t xml:space="preserve"> </w:t>
+      </w:r>
+      <w:r>
+        <w:t xml:space="preserve">Human decisions and notes remain distinct from model output, creating the basis for audit and future model evaluation.</w:t>
+      </w:r>
+    </w:p>
+    <w:bookmarkEnd w:id="42"/>
+    <w:bookmarkStart w:id="43" w:name="responsible-innovation"/>
+    <w:p>
+      <w:pPr>
+        <w:pStyle w:val="Heading3"/>
+      </w:pPr>
+      <w:r>
+        <w:t xml:space="preserve">Responsible innovation</w:t>
+      </w:r>
+    </w:p>
+    <w:p>
+      <w:pPr>
+        <w:pStyle w:val="Compact"/>
+        <w:numPr>
+          <w:ilvl w:val="0"/>
+          <w:numId w:val="1008"/>
+        </w:numPr>
+      </w:pPr>
+      <w:r>
+        <w:t xml:space="preserve">Uses financial-behavior signals relevant to the assessment purpose.</w:t>
+      </w:r>
+    </w:p>
+    <w:p>
+      <w:pPr>
+        <w:pStyle w:val="Compact"/>
+        <w:numPr>
+          <w:ilvl w:val="0"/>
+          <w:numId w:val="1008"/>
+        </w:numPr>
+      </w:pPr>
+      <w:r>
+        <w:t xml:space="preserve">Excludes protected attributes and unnecessary personal data.</w:t>
+      </w:r>
+    </w:p>
+    <w:p>
+      <w:pPr>
+        <w:pStyle w:val="Compact"/>
+        <w:numPr>
+          <w:ilvl w:val="0"/>
+          <w:numId w:val="1008"/>
+        </w:numPr>
+      </w:pPr>
+      <w:r>
+        <w:t xml:space="preserve">Makes data gaps and uncertainty visible.</w:t>
+      </w:r>
+    </w:p>
+    <w:p>
+      <w:pPr>
+        <w:pStyle w:val="Compact"/>
+        <w:numPr>
+          <w:ilvl w:val="0"/>
+          <w:numId w:val="1008"/>
+        </w:numPr>
+      </w:pPr>
+      <w:r>
+        <w:t xml:space="preserve">Requires explicit human review.</w:t>
+      </w:r>
+    </w:p>
+    <w:p>
+      <w:pPr>
+        <w:pStyle w:val="Compact"/>
+        <w:numPr>
+          <w:ilvl w:val="0"/>
+          <w:numId w:val="1008"/>
+        </w:numPr>
+      </w:pPr>
+      <w:r>
+        <w:t xml:space="preserve">Provides a path for applicants to understand and dispute the evidence used.</w:t>
+      </w:r>
+    </w:p>
+    <w:bookmarkEnd w:id="43"/>
+    <w:bookmarkEnd w:id="44"/>
+    <w:bookmarkStart w:id="56" w:name="X2a11da496f1096189630a2e7a918cebdf950afa"/>
+    <w:p>
+      <w:pPr>
+        <w:pStyle w:val="Heading2"/>
+      </w:pPr>
+      <w:r>
+        <w:t xml:space="preserve">6. Market Research</w:t>
+      </w:r>
+    </w:p>
+    <w:bookmarkStart w:id="45" w:name="market-need"/>
+    <w:p>
+      <w:pPr>
+        <w:pStyle w:val="Heading3"/>
+      </w:pPr>
+      <w:r>
+        <w:t xml:space="preserve">Market need</w:t>
+      </w:r>
+    </w:p>
+    <w:p>
+      <w:pPr>
+        <w:pStyle w:val="FirstParagraph"/>
+      </w:pPr>
+      <w:r>
+        <w:t xml:space="preserve">India's platform and gig workforce is expanding while underwriting processes remain primarily designed around formal salary employment. NITI Aayog estimated approximately</w:t>
+      </w:r>
+      <w:r>
+        <w:t xml:space="preserve"> </w:t>
+      </w:r>
+      <w:r>
+        <w:rPr>
+          <w:b/>
+          <w:bCs/>
+        </w:rPr>
+        <w:t xml:space="preserve">7.7 million gig workers in 2020–21</w:t>
+      </w:r>
+      <w:r>
+        <w:t xml:space="preserve"> </w:t>
+      </w:r>
+      <w:r>
+        <w:t xml:space="preserve">and projected that the workforce could reach</w:t>
+      </w:r>
+      <w:r>
+        <w:t xml:space="preserve"> </w:t>
+      </w:r>
+      <w:r>
+        <w:rPr>
+          <w:b/>
+          <w:bCs/>
+        </w:rPr>
+        <w:t xml:space="preserve">23.5 million by 2029–30</w:t>
+      </w:r>
+      <w:r>
+        <w:t xml:space="preserve">. This growth creates a large population whose work is digitally recorded but whose income may not fit conventional documentation.</w:t>
+      </w:r>
+    </w:p>
+    <w:p>
+      <w:pPr>
+        <w:pStyle w:val="BodyText"/>
+      </w:pPr>
+      <w:r>
+        <w:t xml:space="preserve">At the same time, bank-account and digital-payment adoption has increased the amount of consentable cash-flow evidence available for analysis. India's Account Aggregator framework also provides a regulated direction for consent-based financial-data sharing. These developments make cash-flow underwriting more practical than it was when credit assessment depended mainly on paper salary records and prior loans.</w:t>
+      </w:r>
+    </w:p>
+    <w:bookmarkEnd w:id="45"/>
+    <w:bookmarkStart w:id="46" w:name="target-customers"/>
+    <w:p>
+      <w:pPr>
+        <w:pStyle w:val="Heading3"/>
+      </w:pPr>
+      <w:r>
+        <w:t xml:space="preserve">Target customers</w:t>
+      </w:r>
+    </w:p>
+    <w:p>
+      <w:pPr>
+        <w:pStyle w:val="FirstParagraph"/>
+      </w:pPr>
+      <w:r>
+        <w:t xml:space="preserve">The initial business-to-business customers are:</w:t>
+      </w:r>
+    </w:p>
+    <w:p>
+      <w:pPr>
+        <w:pStyle w:val="Compact"/>
+        <w:numPr>
+          <w:ilvl w:val="0"/>
+          <w:numId w:val="1009"/>
+        </w:numPr>
+      </w:pPr>
+      <w:r>
+        <w:t xml:space="preserve">NBFCs and digital lenders serving self-employed or new-to-credit applicants</w:t>
+      </w:r>
+    </w:p>
+    <w:p>
+      <w:pPr>
+        <w:pStyle w:val="Compact"/>
+        <w:numPr>
+          <w:ilvl w:val="0"/>
+          <w:numId w:val="1009"/>
+        </w:numPr>
+      </w:pPr>
+      <w:r>
+        <w:t xml:space="preserve">Banks developing small-ticket personal or productive-asset loans</w:t>
+      </w:r>
+    </w:p>
+    <w:p>
+      <w:pPr>
+        <w:pStyle w:val="Compact"/>
+        <w:numPr>
+          <w:ilvl w:val="0"/>
+          <w:numId w:val="1009"/>
+        </w:numPr>
+      </w:pPr>
+      <w:r>
+        <w:t xml:space="preserve">Gig platforms offering worker benefits or embedded financial products</w:t>
+      </w:r>
+    </w:p>
+    <w:p>
+      <w:pPr>
+        <w:pStyle w:val="Compact"/>
+        <w:numPr>
+          <w:ilvl w:val="0"/>
+          <w:numId w:val="1009"/>
+        </w:numPr>
+      </w:pPr>
+      <w:r>
+        <w:t xml:space="preserve">FinTech infrastructure providers that want an explainable gig-income assessment module</w:t>
+      </w:r>
+    </w:p>
+    <w:p>
+      <w:pPr>
+        <w:pStyle w:val="Compact"/>
+        <w:numPr>
+          <w:ilvl w:val="0"/>
+          <w:numId w:val="1009"/>
+        </w:numPr>
+      </w:pPr>
+      <w:r>
+        <w:t xml:space="preserve">Cooperatives and financial-inclusion programs evaluating non-salaried borrowers</w:t>
+      </w:r>
+    </w:p>
+    <w:bookmarkEnd w:id="46"/>
+    <w:bookmarkStart w:id="47" w:name="competitive-landscape"/>
+    <w:p>
+      <w:pPr>
+        <w:pStyle w:val="Heading3"/>
+      </w:pPr>
+      <w:r>
+        <w:t xml:space="preserve">Competitive landscape</w:t>
       </w:r>
     </w:p>
     <w:tbl>
@@ -679,31 +2158,31 @@
               <w:jc w:val="left"/>
             </w:pPr>
             <w:r>
-              <w:t xml:space="preserve">Factor</w:t>
-            </w:r>
-          </w:p>
-        </w:tc>
-        <w:tc>
-          <w:tcPr/>
-          <w:p>
-            <w:pPr>
-              <w:pStyle w:val="Compact"/>
-              <w:jc w:val="right"/>
-            </w:pPr>
-            <w:r>
-              <w:t xml:space="preserve">Maximum points</w:t>
-            </w:r>
-          </w:p>
-        </w:tc>
-        <w:tc>
-          <w:tcPr/>
-          <w:p>
-            <w:pPr>
-              <w:pStyle w:val="Compact"/>
-              <w:jc w:val="left"/>
-            </w:pPr>
-            <w:r>
-              <w:t xml:space="preserve">Financial question answered</w:t>
+              <w:t xml:space="preserve">Category</w:t>
+            </w:r>
+          </w:p>
+        </w:tc>
+        <w:tc>
+          <w:tcPr/>
+          <w:p>
+            <w:pPr>
+              <w:pStyle w:val="Compact"/>
+              <w:jc w:val="left"/>
+            </w:pPr>
+            <w:r>
+              <w:t xml:space="preserve">Typical strength</w:t>
+            </w:r>
+          </w:p>
+        </w:tc>
+        <w:tc>
+          <w:tcPr/>
+          <w:p>
+            <w:pPr>
+              <w:pStyle w:val="Compact"/>
+              <w:jc w:val="left"/>
+            </w:pPr>
+            <w:r>
+              <w:t xml:space="preserve">Gap EarnScore addresses</w:t>
             </w:r>
           </w:p>
         </w:tc>
@@ -717,31 +2196,31 @@
               <w:jc w:val="left"/>
             </w:pPr>
             <w:r>
-              <w:t xml:space="preserve">Income consistency</w:t>
-            </w:r>
-          </w:p>
-        </w:tc>
-        <w:tc>
-          <w:tcPr/>
-          <w:p>
-            <w:pPr>
-              <w:pStyle w:val="Compact"/>
-              <w:jc w:val="right"/>
-            </w:pPr>
-            <w:r>
-              <w:t xml:space="preserve">180</w:t>
-            </w:r>
-          </w:p>
-        </w:tc>
-        <w:tc>
-          <w:tcPr/>
-          <w:p>
-            <w:pPr>
-              <w:pStyle w:val="Compact"/>
-              <w:jc w:val="left"/>
-            </w:pPr>
-            <w:r>
-              <w:t xml:space="preserve">Does the applicant earn during most observed periods?</w:t>
+              <w:t xml:space="preserve">Traditional credit bureaus</w:t>
+            </w:r>
+          </w:p>
+        </w:tc>
+        <w:tc>
+          <w:tcPr/>
+          <w:p>
+            <w:pPr>
+              <w:pStyle w:val="Compact"/>
+              <w:jc w:val="left"/>
+            </w:pPr>
+            <w:r>
+              <w:t xml:space="preserve">Established repayment-history data and lender acceptance</w:t>
+            </w:r>
+          </w:p>
+        </w:tc>
+        <w:tc>
+          <w:tcPr/>
+          <w:p>
+            <w:pPr>
+              <w:pStyle w:val="Compact"/>
+              <w:jc w:val="left"/>
+            </w:pPr>
+            <w:r>
+              <w:t xml:space="preserve">Limited evidence for people with little or no formal borrowing history</w:t>
             </w:r>
           </w:p>
         </w:tc>
@@ -755,31 +2234,31 @@
               <w:jc w:val="left"/>
             </w:pPr>
             <w:r>
-              <w:t xml:space="preserve">Income stability</w:t>
-            </w:r>
-          </w:p>
-        </w:tc>
-        <w:tc>
-          <w:tcPr/>
-          <w:p>
-            <w:pPr>
-              <w:pStyle w:val="Compact"/>
-              <w:jc w:val="right"/>
-            </w:pPr>
-            <w:r>
-              <w:t xml:space="preserve">130</w:t>
-            </w:r>
-          </w:p>
-        </w:tc>
-        <w:tc>
-          <w:tcPr/>
-          <w:p>
-            <w:pPr>
-              <w:pStyle w:val="Compact"/>
-              <w:jc w:val="left"/>
-            </w:pPr>
-            <w:r>
-              <w:t xml:space="preserve">How much does income fluctuate between months?</w:t>
+              <w:t xml:space="preserve">Bank-statement analytics providers</w:t>
+            </w:r>
+          </w:p>
+        </w:tc>
+        <w:tc>
+          <w:tcPr/>
+          <w:p>
+            <w:pPr>
+              <w:pStyle w:val="Compact"/>
+              <w:jc w:val="left"/>
+            </w:pPr>
+            <w:r>
+              <w:t xml:space="preserve">Transaction categorization and financial ratios</w:t>
+            </w:r>
+          </w:p>
+        </w:tc>
+        <w:tc>
+          <w:tcPr/>
+          <w:p>
+            <w:pPr>
+              <w:pStyle w:val="Compact"/>
+              <w:jc w:val="left"/>
+            </w:pPr>
+            <w:r>
+              <w:t xml:space="preserve">May provide analytics without a gig-worker-specific, judgeable earning-resilience narrative</w:t>
             </w:r>
           </w:p>
         </w:tc>
@@ -793,31 +2272,31 @@
               <w:jc w:val="left"/>
             </w:pPr>
             <w:r>
-              <w:t xml:space="preserve">Cash-flow health</w:t>
-            </w:r>
-          </w:p>
-        </w:tc>
-        <w:tc>
-          <w:tcPr/>
-          <w:p>
-            <w:pPr>
-              <w:pStyle w:val="Compact"/>
-              <w:jc w:val="right"/>
-            </w:pPr>
-            <w:r>
-              <w:t xml:space="preserve">110</w:t>
-            </w:r>
-          </w:p>
-        </w:tc>
-        <w:tc>
-          <w:tcPr/>
-          <w:p>
-            <w:pPr>
-              <w:pStyle w:val="Compact"/>
-              <w:jc w:val="left"/>
-            </w:pPr>
-            <w:r>
-              <w:t xml:space="preserve">Does income generally cover observed expenses?</w:t>
+              <w:t xml:space="preserve">Alternative-data scoring companies</w:t>
+            </w:r>
+          </w:p>
+        </w:tc>
+        <w:tc>
+          <w:tcPr/>
+          <w:p>
+            <w:pPr>
+              <w:pStyle w:val="Compact"/>
+              <w:jc w:val="left"/>
+            </w:pPr>
+            <w:r>
+              <w:t xml:space="preserve">Broader digital signals and automated risk models</w:t>
+            </w:r>
+          </w:p>
+        </w:tc>
+        <w:tc>
+          <w:tcPr/>
+          <w:p>
+            <w:pPr>
+              <w:pStyle w:val="Compact"/>
+              <w:jc w:val="left"/>
+            </w:pPr>
+            <w:r>
+              <w:t xml:space="preserve">Can be difficult for applicants or reviewers to interpret; some signals may raise privacy concerns</w:t>
             </w:r>
           </w:p>
         </w:tc>
@@ -831,31 +2310,31 @@
               <w:jc w:val="left"/>
             </w:pPr>
             <w:r>
-              <w:t xml:space="preserve">Source resilience</w:t>
-            </w:r>
-          </w:p>
-        </w:tc>
-        <w:tc>
-          <w:tcPr/>
-          <w:p>
-            <w:pPr>
-              <w:pStyle w:val="Compact"/>
-              <w:jc w:val="right"/>
-            </w:pPr>
-            <w:r>
-              <w:t xml:space="preserve">70</w:t>
-            </w:r>
-          </w:p>
-        </w:tc>
-        <w:tc>
-          <w:tcPr/>
-          <w:p>
-            <w:pPr>
-              <w:pStyle w:val="Compact"/>
-              <w:jc w:val="left"/>
-            </w:pPr>
-            <w:r>
-              <w:t xml:space="preserve">Is income overly dependent on one source?</w:t>
+              <w:t xml:space="preserve">Lender-specific underwriting models</w:t>
+            </w:r>
+          </w:p>
+        </w:tc>
+        <w:tc>
+          <w:tcPr/>
+          <w:p>
+            <w:pPr>
+              <w:pStyle w:val="Compact"/>
+              <w:jc w:val="left"/>
+            </w:pPr>
+            <w:r>
+              <w:t xml:space="preserve">Optimized for one lender's portfolio</w:t>
+            </w:r>
+          </w:p>
+        </w:tc>
+        <w:tc>
+          <w:tcPr/>
+          <w:p>
+            <w:pPr>
+              <w:pStyle w:val="Compact"/>
+              <w:jc w:val="left"/>
+            </w:pPr>
+            <w:r>
+              <w:t xml:space="preserve">Often difficult to reuse across institutions and may remain hidden from front-line reviewers</w:t>
             </w:r>
           </w:p>
         </w:tc>
@@ -869,168 +2348,75 @@
               <w:jc w:val="left"/>
             </w:pPr>
             <w:r>
-              <w:t xml:space="preserve">Income trend</w:t>
-            </w:r>
-          </w:p>
-        </w:tc>
-        <w:tc>
-          <w:tcPr/>
-          <w:p>
-            <w:pPr>
-              <w:pStyle w:val="Compact"/>
-              <w:jc w:val="right"/>
-            </w:pPr>
-            <w:r>
-              <w:t xml:space="preserve">50</w:t>
-            </w:r>
-          </w:p>
-        </w:tc>
-        <w:tc>
-          <w:tcPr/>
-          <w:p>
-            <w:pPr>
-              <w:pStyle w:val="Compact"/>
-              <w:jc w:val="left"/>
-            </w:pPr>
-            <w:r>
-              <w:t xml:space="preserve">Is recent earning capacity stable or improving?</w:t>
-            </w:r>
-          </w:p>
-        </w:tc>
-      </w:tr>
-      <w:tr>
-        <w:tc>
-          <w:tcPr/>
-          <w:p>
-            <w:pPr>
-              <w:pStyle w:val="Compact"/>
-              <w:jc w:val="left"/>
-            </w:pPr>
-            <w:r>
-              <w:t xml:space="preserve">Financial buffer</w:t>
-            </w:r>
-          </w:p>
-        </w:tc>
-        <w:tc>
-          <w:tcPr/>
-          <w:p>
-            <w:pPr>
-              <w:pStyle w:val="Compact"/>
-              <w:jc w:val="right"/>
-            </w:pPr>
-            <w:r>
-              <w:t xml:space="preserve">60</w:t>
-            </w:r>
-          </w:p>
-        </w:tc>
-        <w:tc>
-          <w:tcPr/>
-          <w:p>
-            <w:pPr>
-              <w:pStyle w:val="Compact"/>
-              <w:jc w:val="left"/>
-            </w:pPr>
-            <w:r>
-              <w:t xml:space="preserve">Is there a visible cushion against short interruptions?</w:t>
+              <w:t xml:space="preserve">EarnScore</w:t>
+            </w:r>
+          </w:p>
+        </w:tc>
+        <w:tc>
+          <w:tcPr/>
+          <w:p>
+            <w:pPr>
+              <w:pStyle w:val="Compact"/>
+              <w:jc w:val="left"/>
+            </w:pPr>
+            <w:r>
+              <w:t xml:space="preserve">Gig-income consolidation, confidence separation, evidence-backed explanations, and human review</w:t>
+            </w:r>
+          </w:p>
+        </w:tc>
+        <w:tc>
+          <w:tcPr/>
+          <w:p>
+            <w:pPr>
+              <w:pStyle w:val="Compact"/>
+              <w:jc w:val="left"/>
+            </w:pPr>
+            <w:r>
+              <w:t xml:space="preserve">Requires outcome-data calibration and integrations before production lending use</w:t>
             </w:r>
           </w:p>
         </w:tc>
       </w:tr>
     </w:tbl>
-    <w:p>
-      <w:pPr>
-        <w:pStyle w:val="BodyText"/>
-      </w:pPr>
-      <w:r>
-        <w:t xml:space="preserve">The result is clamped between 300 and 900. Suggested interpretation bands are:</w:t>
-      </w:r>
-    </w:p>
-    <w:p>
-      <w:pPr>
-        <w:pStyle w:val="Compact"/>
-        <w:numPr>
-          <w:ilvl w:val="0"/>
-          <w:numId w:val="1002"/>
-        </w:numPr>
-      </w:pPr>
+    <w:bookmarkEnd w:id="47"/>
+    <w:bookmarkStart w:id="48" w:name="positioning"/>
+    <w:p>
+      <w:pPr>
+        <w:pStyle w:val="Heading3"/>
+      </w:pPr>
+      <w:r>
+        <w:t xml:space="preserve">Positioning</w:t>
+      </w:r>
+    </w:p>
+    <w:p>
+      <w:pPr>
+        <w:pStyle w:val="FirstParagraph"/>
+      </w:pPr>
+      <w:r>
+        <w:t xml:space="preserve">EarnScore should initially be positioned as an</w:t>
+      </w:r>
+      <w:r>
+        <w:t xml:space="preserve"> </w:t>
+      </w:r>
       <w:r>
         <w:rPr>
           <w:b/>
           <w:bCs/>
         </w:rPr>
-        <w:t xml:space="preserve">750–900 — Strong:</w:t>
-      </w:r>
-      <w:r>
-        <w:t xml:space="preserve"> </w:t>
-      </w:r>
-      <w:r>
-        <w:t xml:space="preserve">consistent and resilient observed earning pattern</w:t>
-      </w:r>
-    </w:p>
-    <w:p>
-      <w:pPr>
-        <w:pStyle w:val="Compact"/>
-        <w:numPr>
-          <w:ilvl w:val="0"/>
-          <w:numId w:val="1002"/>
-        </w:numPr>
-      </w:pPr>
-      <w:r>
-        <w:rPr>
-          <w:b/>
-          <w:bCs/>
-        </w:rPr>
-        <w:t xml:space="preserve">650–749 — Stable:</w:t>
-      </w:r>
-      <w:r>
-        <w:t xml:space="preserve"> </w:t>
-      </w:r>
-      <w:r>
-        <w:t xml:space="preserve">generally healthy pattern with limited concerns</w:t>
-      </w:r>
-    </w:p>
-    <w:p>
-      <w:pPr>
-        <w:pStyle w:val="Compact"/>
-        <w:numPr>
-          <w:ilvl w:val="0"/>
-          <w:numId w:val="1002"/>
-        </w:numPr>
-      </w:pPr>
-      <w:r>
-        <w:rPr>
-          <w:b/>
-          <w:bCs/>
-        </w:rPr>
-        <w:t xml:space="preserve">550–649 — Developing:</w:t>
-      </w:r>
-      <w:r>
-        <w:t xml:space="preserve"> </w:t>
-      </w:r>
-      <w:r>
-        <w:t xml:space="preserve">useful earning evidence with volatility or gaps</w:t>
-      </w:r>
-    </w:p>
-    <w:p>
-      <w:pPr>
-        <w:pStyle w:val="Compact"/>
-        <w:numPr>
-          <w:ilvl w:val="0"/>
-          <w:numId w:val="1002"/>
-        </w:numPr>
-      </w:pPr>
-      <w:r>
-        <w:rPr>
-          <w:b/>
-          <w:bCs/>
-        </w:rPr>
-        <w:t xml:space="preserve">300–549 — Limited evidence / higher volatility:</w:t>
-      </w:r>
-      <w:r>
-        <w:t xml:space="preserve"> </w:t>
-      </w:r>
-      <w:r>
-        <w:t xml:space="preserve">insufficient history or material instability requiring closer review</w:t>
+        <w:t xml:space="preserve">underwriting intelligence layer</w:t>
+      </w:r>
+      <w:r>
+        <w:t xml:space="preserve">, not as a lender or replacement for a credit bureau. It complements bureau history with current cash-flow evidence and gives analysts a consistent way to review non-salaried applicants.</w:t>
+      </w:r>
+    </w:p>
+    <w:bookmarkEnd w:id="48"/>
+    <w:bookmarkStart w:id="49" w:name="business-model"/>
+    <w:p>
+      <w:pPr>
+        <w:pStyle w:val="Heading3"/>
+      </w:pPr>
+      <w:r>
+        <w:t xml:space="preserve">Business model</w:t>
       </w:r>
     </w:p>
     <w:p>
@@ -1038,1199 +2424,134 @@
         <w:pStyle w:val="FirstParagraph"/>
       </w:pPr>
       <w:r>
-        <w:t xml:space="preserve">These bands describe observed financial behavior. They do not claim a validated probability of default. Production use would require lender-specific outcome data, calibration, bias testing, regulatory review, and continuous monitoring.</w:t>
-      </w:r>
-    </w:p>
-    <w:bookmarkEnd w:id="30"/>
-    <w:bookmarkStart w:id="31" w:name="mvp-architecture"/>
+        <w:t xml:space="preserve">A production version could use a tiered B2B model:</w:t>
+      </w:r>
+    </w:p>
+    <w:p>
+      <w:pPr>
+        <w:pStyle w:val="Compact"/>
+        <w:numPr>
+          <w:ilvl w:val="0"/>
+          <w:numId w:val="1010"/>
+        </w:numPr>
+      </w:pPr>
+      <w:r>
+        <w:t xml:space="preserve">API fee per completed applicant analysis</w:t>
+      </w:r>
+    </w:p>
+    <w:p>
+      <w:pPr>
+        <w:pStyle w:val="Compact"/>
+        <w:numPr>
+          <w:ilvl w:val="0"/>
+          <w:numId w:val="1010"/>
+        </w:numPr>
+      </w:pPr>
+      <w:r>
+        <w:t xml:space="preserve">Monthly subscription for lender dashboard users</w:t>
+      </w:r>
+    </w:p>
+    <w:p>
+      <w:pPr>
+        <w:pStyle w:val="Compact"/>
+        <w:numPr>
+          <w:ilvl w:val="0"/>
+          <w:numId w:val="1010"/>
+        </w:numPr>
+      </w:pPr>
+      <w:r>
+        <w:t xml:space="preserve">Enterprise pricing for private deployment, custom policy rules, monitoring, and audit support</w:t>
+      </w:r>
+    </w:p>
+    <w:p>
+      <w:pPr>
+        <w:pStyle w:val="Compact"/>
+        <w:numPr>
+          <w:ilvl w:val="0"/>
+          <w:numId w:val="1010"/>
+        </w:numPr>
+      </w:pPr>
+      <w:r>
+        <w:t xml:space="preserve">Platform partnerships for embedded worker financial-wellness or credit-readiness tools</w:t>
+      </w:r>
+    </w:p>
+    <w:bookmarkEnd w:id="49"/>
+    <w:bookmarkStart w:id="50" w:name="go-to-market-sequence"/>
     <w:p>
       <w:pPr>
         <w:pStyle w:val="Heading3"/>
       </w:pPr>
       <w:r>
-        <w:t xml:space="preserve">MVP architecture</w:t>
-      </w:r>
-    </w:p>
-    <w:p>
-      <w:pPr>
-        <w:pStyle w:val="SourceCode"/>
-      </w:pPr>
-      <w:r>
-        <w:rPr>
-          <w:rStyle w:val="VerbatimChar"/>
-        </w:rPr>
-        <w:t xml:space="preserve">CSV / simulated gig records</w:t>
-      </w:r>
-      <w:r>
-        <w:br/>
-      </w:r>
-      <w:r>
-        <w:rPr>
-          <w:rStyle w:val="VerbatimChar"/>
-        </w:rPr>
-        <w:t xml:space="preserve">            |</w:t>
-      </w:r>
-      <w:r>
-        <w:br/>
-      </w:r>
-      <w:r>
-        <w:rPr>
-          <w:rStyle w:val="VerbatimChar"/>
-        </w:rPr>
-        <w:t xml:space="preserve">            v</w:t>
-      </w:r>
-      <w:r>
-        <w:br/>
-      </w:r>
-      <w:r>
-        <w:rPr>
-          <w:rStyle w:val="VerbatimChar"/>
-        </w:rPr>
-        <w:t xml:space="preserve">Ingestion and normalization pipeline</w:t>
-      </w:r>
-      <w:r>
-        <w:br/>
-      </w:r>
-      <w:r>
-        <w:rPr>
-          <w:rStyle w:val="VerbatimChar"/>
-        </w:rPr>
-        <w:t xml:space="preserve">            |</w:t>
-      </w:r>
-      <w:r>
-        <w:br/>
-      </w:r>
-      <w:r>
-        <w:rPr>
-          <w:rStyle w:val="VerbatimChar"/>
-        </w:rPr>
-        <w:t xml:space="preserve">            v</w:t>
-      </w:r>
-      <w:r>
-        <w:br/>
-      </w:r>
-      <w:r>
-        <w:rPr>
-          <w:rStyle w:val="VerbatimChar"/>
-        </w:rPr>
-        <w:t xml:space="preserve">Feature extraction and data-quality checks</w:t>
-      </w:r>
-      <w:r>
-        <w:br/>
-      </w:r>
-      <w:r>
-        <w:rPr>
-          <w:rStyle w:val="VerbatimChar"/>
-        </w:rPr>
-        <w:t xml:space="preserve">            |</w:t>
-      </w:r>
-      <w:r>
-        <w:br/>
-      </w:r>
-      <w:r>
-        <w:rPr>
-          <w:rStyle w:val="VerbatimChar"/>
-        </w:rPr>
-        <w:t xml:space="preserve">            v</w:t>
-      </w:r>
-      <w:r>
-        <w:br/>
-      </w:r>
-      <w:r>
-        <w:rPr>
-          <w:rStyle w:val="VerbatimChar"/>
-        </w:rPr>
-        <w:t xml:space="preserve">Explainable scoring API + confidence engine</w:t>
-      </w:r>
-      <w:r>
-        <w:br/>
-      </w:r>
-      <w:r>
-        <w:rPr>
-          <w:rStyle w:val="VerbatimChar"/>
-        </w:rPr>
-        <w:t xml:space="preserve">            |</w:t>
-      </w:r>
-      <w:r>
-        <w:br/>
-      </w:r>
-      <w:r>
-        <w:rPr>
-          <w:rStyle w:val="VerbatimChar"/>
-        </w:rPr>
-        <w:t xml:space="preserve">            v</w:t>
-      </w:r>
-      <w:r>
-        <w:br/>
-      </w:r>
-      <w:r>
-        <w:rPr>
-          <w:rStyle w:val="VerbatimChar"/>
-        </w:rPr>
-        <w:t xml:space="preserve">Lender dashboard, evidence view, and human review</w:t>
-      </w:r>
-    </w:p>
-    <w:p>
-      <w:pPr>
-        <w:pStyle w:val="FirstParagraph"/>
-      </w:pPr>
-      <w:r>
-        <w:t xml:space="preserve">The hackathon implementation uses React, TypeScript, Tailwind CSS, and Recharts for the dashboard; Python, FastAPI, Pydantic, and pandas for analysis; and SQLite or in-memory fixtures for demonstration storage.</w:t>
-      </w:r>
-    </w:p>
-    <w:bookmarkEnd w:id="31"/>
-    <w:bookmarkStart w:id="32" w:name="demonstration-scenarios"/>
+        <w:t xml:space="preserve">Go-to-market sequence</w:t>
+      </w:r>
+    </w:p>
+    <w:p>
+      <w:pPr>
+        <w:pStyle w:val="Compact"/>
+        <w:numPr>
+          <w:ilvl w:val="0"/>
+          <w:numId w:val="1011"/>
+        </w:numPr>
+      </w:pPr>
+      <w:r>
+        <w:t xml:space="preserve">Pilot with one lender or gig platform using historical, consented, de-identified data.</w:t>
+      </w:r>
+    </w:p>
+    <w:p>
+      <w:pPr>
+        <w:pStyle w:val="Compact"/>
+        <w:numPr>
+          <w:ilvl w:val="0"/>
+          <w:numId w:val="1011"/>
+        </w:numPr>
+      </w:pPr>
+      <w:r>
+        <w:t xml:space="preserve">Validate whether EarnScore features improve review coverage and decision consistency.</w:t>
+      </w:r>
+    </w:p>
+    <w:p>
+      <w:pPr>
+        <w:pStyle w:val="Compact"/>
+        <w:numPr>
+          <w:ilvl w:val="0"/>
+          <w:numId w:val="1011"/>
+        </w:numPr>
+      </w:pPr>
+      <w:r>
+        <w:t xml:space="preserve">Calibrate against repayment outcomes without removing explainability.</w:t>
+      </w:r>
+    </w:p>
+    <w:p>
+      <w:pPr>
+        <w:pStyle w:val="Compact"/>
+        <w:numPr>
+          <w:ilvl w:val="0"/>
+          <w:numId w:val="1011"/>
+        </w:numPr>
+      </w:pPr>
+      <w:r>
+        <w:t xml:space="preserve">Run fairness, stability, privacy, and regulatory assessments.</w:t>
+      </w:r>
+    </w:p>
+    <w:p>
+      <w:pPr>
+        <w:pStyle w:val="Compact"/>
+        <w:numPr>
+          <w:ilvl w:val="0"/>
+          <w:numId w:val="1011"/>
+        </w:numPr>
+      </w:pPr>
+      <w:r>
+        <w:t xml:space="preserve">Launch as a decision-support API and dashboard for a narrowly defined credit product.</w:t>
+      </w:r>
+    </w:p>
+    <w:bookmarkEnd w:id="50"/>
+    <w:bookmarkStart w:id="55" w:name="research-references"/>
     <w:p>
       <w:pPr>
         <w:pStyle w:val="Heading3"/>
       </w:pPr>
       <w:r>
-        <w:t xml:space="preserve">Demonstration scenarios</w:t>
-      </w:r>
-    </w:p>
-    <w:p>
-      <w:pPr>
-        <w:pStyle w:val="Compact"/>
-        <w:numPr>
-          <w:ilvl w:val="0"/>
-          <w:numId w:val="1003"/>
-        </w:numPr>
-      </w:pPr>
-      <w:r>
-        <w:rPr>
-          <w:b/>
-          <w:bCs/>
-        </w:rPr>
-        <w:t xml:space="preserve">Stable multi-platform worker:</w:t>
-      </w:r>
-      <w:r>
-        <w:t xml:space="preserve"> </w:t>
-      </w:r>
-      <w:r>
-        <w:t xml:space="preserve">moderate income, regular earnings, multiple sources, and healthy cash flow.</w:t>
-      </w:r>
-    </w:p>
-    <w:p>
-      <w:pPr>
-        <w:pStyle w:val="Compact"/>
-        <w:numPr>
-          <w:ilvl w:val="0"/>
-          <w:numId w:val="1003"/>
-        </w:numPr>
-      </w:pPr>
-      <w:r>
-        <w:rPr>
-          <w:b/>
-          <w:bCs/>
-        </w:rPr>
-        <w:t xml:space="preserve">High-income but volatile worker:</w:t>
-      </w:r>
-      <w:r>
-        <w:t xml:space="preserve"> </w:t>
-      </w:r>
-      <w:r>
-        <w:t xml:space="preserve">higher total income with long gaps and concentrated payments.</w:t>
-      </w:r>
-    </w:p>
-    <w:p>
-      <w:pPr>
-        <w:pStyle w:val="Compact"/>
-        <w:numPr>
-          <w:ilvl w:val="0"/>
-          <w:numId w:val="1003"/>
-        </w:numPr>
-      </w:pPr>
-      <w:r>
-        <w:rPr>
-          <w:b/>
-          <w:bCs/>
-        </w:rPr>
-        <w:t xml:space="preserve">New or seasonal worker:</w:t>
-      </w:r>
-      <w:r>
-        <w:t xml:space="preserve"> </w:t>
-      </w:r>
-      <w:r>
-        <w:t xml:space="preserve">valid earnings but limited history, producing lower confidence and a request for more information.</w:t>
-      </w:r>
-    </w:p>
-    <w:p>
-      <w:pPr>
-        <w:pStyle w:val="FirstParagraph"/>
-      </w:pPr>
-      <w:r>
-        <w:t xml:space="preserve">These scenarios demonstrate that EarnScore rewards the quality and resilience of earning patterns rather than simply favoring the applicant with the highest income.</w:t>
-      </w:r>
-    </w:p>
-    <w:bookmarkEnd w:id="32"/>
-    <w:bookmarkEnd w:id="33"/>
-    <w:bookmarkStart w:id="39" w:name="X843d442355a0d838ec32fb9e05b3f4dd6cf9a41"/>
-    <w:p>
-      <w:pPr>
-        <w:pStyle w:val="Heading2"/>
-      </w:pPr>
-      <w:r>
-        <w:t xml:space="preserve">4. Novelty</w:t>
-      </w:r>
-    </w:p>
-    <w:bookmarkStart w:id="34" w:name="X9c1fef61d3d775d48f112abf9a7c150d28e1a9f"/>
-    <w:p>
-      <w:pPr>
-        <w:pStyle w:val="Heading3"/>
-      </w:pPr>
-      <w:r>
-        <w:t xml:space="preserve">A unified earning identity instead of a salary substitute</w:t>
-      </w:r>
-    </w:p>
-    <w:p>
-      <w:pPr>
-        <w:pStyle w:val="FirstParagraph"/>
-      </w:pPr>
-      <w:r>
-        <w:t xml:space="preserve">EarnScore does more than estimate a monthly salary from bank credits. It constructs a consolidated earning profile from several fragmented sources and evaluates how those sources behave together over time.</w:t>
-      </w:r>
-    </w:p>
-    <w:bookmarkEnd w:id="34"/>
-    <w:bookmarkStart w:id="35" w:name="X5b5c3bf13567c2c6629882f5bd6b439fa840dc7"/>
-    <w:p>
-      <w:pPr>
-        <w:pStyle w:val="Heading3"/>
-      </w:pPr>
-      <w:r>
-        <w:t xml:space="preserve">Score and confidence are intentionally separate</w:t>
-      </w:r>
-    </w:p>
-    <w:p>
-      <w:pPr>
-        <w:pStyle w:val="FirstParagraph"/>
-      </w:pPr>
-      <w:r>
-        <w:t xml:space="preserve">Many scoring interfaces present a single authoritative number. EarnScore presents both the financial assessment and the strength of the underlying evidence. A promising pattern supported by incomplete data remains visible, but the system clearly asks the lender for more information.</w:t>
-      </w:r>
-    </w:p>
-    <w:bookmarkEnd w:id="35"/>
-    <w:bookmarkStart w:id="36" w:name="every-factor-is-evidence-backed"/>
-    <w:p>
-      <w:pPr>
-        <w:pStyle w:val="Heading3"/>
-      </w:pPr>
-      <w:r>
-        <w:t xml:space="preserve">Every factor is evidence-backed</w:t>
-      </w:r>
-    </w:p>
-    <w:p>
-      <w:pPr>
-        <w:pStyle w:val="FirstParagraph"/>
-      </w:pPr>
-      <w:r>
-        <w:t xml:space="preserve">A lender can open a factor, read its plain-language explanation, and inspect the values that produced its points. For example, income-consistency points can show that earnings were observed in 11 of 12 months. This makes the result easier to challenge, audit, and explain to an applicant.</w:t>
-      </w:r>
-    </w:p>
-    <w:bookmarkEnd w:id="36"/>
-    <w:bookmarkStart w:id="37" w:name="stability-can-outweigh-absolute-income"/>
-    <w:p>
-      <w:pPr>
-        <w:pStyle w:val="Heading3"/>
-      </w:pPr>
-      <w:r>
-        <w:t xml:space="preserve">Stability can outweigh absolute income</w:t>
-      </w:r>
-    </w:p>
-    <w:p>
-      <w:pPr>
-        <w:pStyle w:val="FirstParagraph"/>
-      </w:pPr>
-      <w:r>
-        <w:t xml:space="preserve">The design deliberately allows a lower-income but consistent worker to score better than a higher-income worker with extreme volatility. This aligns the assessment with sustainable repayment capacity and makes the system relevant to gig work rather than reproducing salary-based ranking.</w:t>
-      </w:r>
-    </w:p>
-    <w:bookmarkEnd w:id="37"/>
-    <w:bookmarkStart w:id="38" w:name="Xf00f8888577fa2084763d13a847498ce9d39e43"/>
-    <w:p>
-      <w:pPr>
-        <w:pStyle w:val="Heading3"/>
-      </w:pPr>
-      <w:r>
-        <w:t xml:space="preserve">Human judgment is part of the product flow</w:t>
-      </w:r>
-    </w:p>
-    <w:p>
-      <w:pPr>
-        <w:pStyle w:val="FirstParagraph"/>
-      </w:pPr>
-      <w:r>
-        <w:t xml:space="preserve">EarnScore records the lender's review separately from the calculated score. It supports structured decision-making while preventing the score from being presented as an automatic approval or rejection engine.</w:t>
-      </w:r>
-    </w:p>
-    <w:bookmarkEnd w:id="38"/>
-    <w:bookmarkEnd w:id="39"/>
-    <w:bookmarkStart w:id="43" w:name="Xad882fcfee705624e0d53244a75e0f93b33b53d"/>
-    <w:p>
-      <w:pPr>
-        <w:pStyle w:val="Heading2"/>
-      </w:pPr>
-      <w:r>
-        <w:t xml:space="preserve">5. Innovation</w:t>
-      </w:r>
-    </w:p>
-    <w:bookmarkStart w:id="40" w:name="technical-innovation"/>
-    <w:p>
-      <w:pPr>
-        <w:pStyle w:val="Heading3"/>
-      </w:pPr>
-      <w:r>
-        <w:t xml:space="preserve">Technical innovation</w:t>
-      </w:r>
-    </w:p>
-    <w:p>
-      <w:pPr>
-        <w:pStyle w:val="Compact"/>
-        <w:numPr>
-          <w:ilvl w:val="0"/>
-          <w:numId w:val="1004"/>
-        </w:numPr>
-      </w:pPr>
-      <w:r>
-        <w:rPr>
-          <w:b/>
-          <w:bCs/>
-        </w:rPr>
-        <w:t xml:space="preserve">Multi-source normalization:</w:t>
-      </w:r>
-      <w:r>
-        <w:t xml:space="preserve"> </w:t>
-      </w:r>
-      <w:r>
-        <w:t xml:space="preserve">Converts different platform and account formats into one auditable transaction timeline.</w:t>
-      </w:r>
-    </w:p>
-    <w:p>
-      <w:pPr>
-        <w:pStyle w:val="Compact"/>
-        <w:numPr>
-          <w:ilvl w:val="0"/>
-          <w:numId w:val="1004"/>
-        </w:numPr>
-      </w:pPr>
-      <w:r>
-        <w:rPr>
-          <w:b/>
-          <w:bCs/>
-        </w:rPr>
-        <w:t xml:space="preserve">Transfer and reversal handling:</w:t>
-      </w:r>
-      <w:r>
-        <w:t xml:space="preserve"> </w:t>
-      </w:r>
-      <w:r>
-        <w:t xml:space="preserve">Reduces false income inflation by identifying duplicates, refunds, reversals, and transfers between an applicant's own accounts.</w:t>
-      </w:r>
-    </w:p>
-    <w:p>
-      <w:pPr>
-        <w:pStyle w:val="Compact"/>
-        <w:numPr>
-          <w:ilvl w:val="0"/>
-          <w:numId w:val="1004"/>
-        </w:numPr>
-      </w:pPr>
-      <w:r>
-        <w:rPr>
-          <w:b/>
-          <w:bCs/>
-        </w:rPr>
-        <w:t xml:space="preserve">Resilience features:</w:t>
-      </w:r>
-      <w:r>
-        <w:t xml:space="preserve"> </w:t>
-      </w:r>
-      <w:r>
-        <w:t xml:space="preserve">Measures source concentration, positive-cash-flow frequency, income gaps, volatility, trends, and buffer days rather than relying on one aggregate income figure.</w:t>
-      </w:r>
-    </w:p>
-    <w:p>
-      <w:pPr>
-        <w:pStyle w:val="Compact"/>
-        <w:numPr>
-          <w:ilvl w:val="0"/>
-          <w:numId w:val="1004"/>
-        </w:numPr>
-      </w:pPr>
-      <w:r>
-        <w:rPr>
-          <w:b/>
-          <w:bCs/>
-        </w:rPr>
-        <w:t xml:space="preserve">Confidence engine:</w:t>
-      </w:r>
-      <w:r>
-        <w:t xml:space="preserve"> </w:t>
-      </w:r>
-      <w:r>
-        <w:t xml:space="preserve">Changes certainty based on data completeness and quality instead of hiding missing evidence inside the score.</w:t>
-      </w:r>
-    </w:p>
-    <w:p>
-      <w:pPr>
-        <w:pStyle w:val="Compact"/>
-        <w:numPr>
-          <w:ilvl w:val="0"/>
-          <w:numId w:val="1004"/>
-        </w:numPr>
-      </w:pPr>
-      <w:r>
-        <w:rPr>
-          <w:b/>
-          <w:bCs/>
-        </w:rPr>
-        <w:t xml:space="preserve">Local demo mode:</w:t>
-      </w:r>
-      <w:r>
-        <w:t xml:space="preserve"> </w:t>
-      </w:r>
-      <w:r>
-        <w:t xml:space="preserve">Uses reproducible fixtures so the full product remains demonstrable without live bank integrations or network access.</w:t>
-      </w:r>
-    </w:p>
-    <w:bookmarkEnd w:id="40"/>
-    <w:bookmarkStart w:id="41" w:name="product-innovation"/>
-    <w:p>
-      <w:pPr>
-        <w:pStyle w:val="Heading3"/>
-      </w:pPr>
-      <w:r>
-        <w:t xml:space="preserve">Product innovation</w:t>
-      </w:r>
-    </w:p>
-    <w:p>
-      <w:pPr>
-        <w:pStyle w:val="Compact"/>
-        <w:numPr>
-          <w:ilvl w:val="0"/>
-          <w:numId w:val="1005"/>
-        </w:numPr>
-      </w:pPr>
-      <w:r>
-        <w:rPr>
-          <w:b/>
-          <w:bCs/>
-        </w:rPr>
-        <w:t xml:space="preserve">Raw-to-understood transformation:</w:t>
-      </w:r>
-      <w:r>
-        <w:t xml:space="preserve"> </w:t>
-      </w:r>
-      <w:r>
-        <w:t xml:space="preserve">The dashboard visually shows how scattered payments become a coherent earning profile.</w:t>
-      </w:r>
-    </w:p>
-    <w:p>
-      <w:pPr>
-        <w:pStyle w:val="Compact"/>
-        <w:numPr>
-          <w:ilvl w:val="0"/>
-          <w:numId w:val="1005"/>
-        </w:numPr>
-      </w:pPr>
-      <w:r>
-        <w:rPr>
-          <w:b/>
-          <w:bCs/>
-        </w:rPr>
-        <w:t xml:space="preserve">Counterfactual comparison:</w:t>
-      </w:r>
-      <w:r>
-        <w:t xml:space="preserve"> </w:t>
-      </w:r>
-      <w:r>
-        <w:t xml:space="preserve">Judges and lenders can compare a stable moderate-income profile with a volatile high-income profile to understand the model's priorities.</w:t>
-      </w:r>
-    </w:p>
-    <w:p>
-      <w:pPr>
-        <w:pStyle w:val="Compact"/>
-        <w:numPr>
-          <w:ilvl w:val="0"/>
-          <w:numId w:val="1005"/>
-        </w:numPr>
-      </w:pPr>
-      <w:r>
-        <w:rPr>
-          <w:b/>
-          <w:bCs/>
-        </w:rPr>
-        <w:t xml:space="preserve">Explainable risk flags:</w:t>
-      </w:r>
-      <w:r>
-        <w:t xml:space="preserve"> </w:t>
-      </w:r>
-      <w:r>
-        <w:t xml:space="preserve">The product highlights income gaps, source dependence, negative cash-flow periods, sparse history, and classification uncertainty with supporting data.</w:t>
-      </w:r>
-    </w:p>
-    <w:p>
-      <w:pPr>
-        <w:pStyle w:val="Compact"/>
-        <w:numPr>
-          <w:ilvl w:val="0"/>
-          <w:numId w:val="1005"/>
-        </w:numPr>
-      </w:pPr>
-      <w:r>
-        <w:rPr>
-          <w:b/>
-          <w:bCs/>
-        </w:rPr>
-        <w:t xml:space="preserve">Reviewable decision trail:</w:t>
-      </w:r>
-      <w:r>
-        <w:t xml:space="preserve"> </w:t>
-      </w:r>
-      <w:r>
-        <w:t xml:space="preserve">Human decisions and notes remain distinct from model output, creating the basis for audit and future model evaluation.</w:t>
-      </w:r>
-    </w:p>
-    <w:bookmarkEnd w:id="41"/>
-    <w:bookmarkStart w:id="42" w:name="responsible-innovation"/>
-    <w:p>
-      <w:pPr>
-        <w:pStyle w:val="Heading3"/>
-      </w:pPr>
-      <w:r>
-        <w:t xml:space="preserve">Responsible innovation</w:t>
-      </w:r>
-    </w:p>
-    <w:p>
-      <w:pPr>
-        <w:pStyle w:val="Compact"/>
-        <w:numPr>
-          <w:ilvl w:val="0"/>
-          <w:numId w:val="1006"/>
-        </w:numPr>
-      </w:pPr>
-      <w:r>
-        <w:t xml:space="preserve">Uses financial-behavior signals relevant to the assessment purpose.</w:t>
-      </w:r>
-    </w:p>
-    <w:p>
-      <w:pPr>
-        <w:pStyle w:val="Compact"/>
-        <w:numPr>
-          <w:ilvl w:val="0"/>
-          <w:numId w:val="1006"/>
-        </w:numPr>
-      </w:pPr>
-      <w:r>
-        <w:t xml:space="preserve">Excludes protected attributes and unnecessary personal data.</w:t>
-      </w:r>
-    </w:p>
-    <w:p>
-      <w:pPr>
-        <w:pStyle w:val="Compact"/>
-        <w:numPr>
-          <w:ilvl w:val="0"/>
-          <w:numId w:val="1006"/>
-        </w:numPr>
-      </w:pPr>
-      <w:r>
-        <w:t xml:space="preserve">Makes data gaps and uncertainty visible.</w:t>
-      </w:r>
-    </w:p>
-    <w:p>
-      <w:pPr>
-        <w:pStyle w:val="Compact"/>
-        <w:numPr>
-          <w:ilvl w:val="0"/>
-          <w:numId w:val="1006"/>
-        </w:numPr>
-      </w:pPr>
-      <w:r>
-        <w:t xml:space="preserve">Requires explicit human review.</w:t>
-      </w:r>
-    </w:p>
-    <w:p>
-      <w:pPr>
-        <w:pStyle w:val="Compact"/>
-        <w:numPr>
-          <w:ilvl w:val="0"/>
-          <w:numId w:val="1006"/>
-        </w:numPr>
-      </w:pPr>
-      <w:r>
-        <w:t xml:space="preserve">Provides a path for applicants to understand and dispute the evidence used.</w:t>
-      </w:r>
-    </w:p>
-    <w:bookmarkEnd w:id="42"/>
-    <w:bookmarkEnd w:id="43"/>
-    <w:bookmarkStart w:id="55" w:name="X2a11da496f1096189630a2e7a918cebdf950afa"/>
-    <w:p>
-      <w:pPr>
-        <w:pStyle w:val="Heading2"/>
-      </w:pPr>
-      <w:r>
-        <w:t xml:space="preserve">6. Market Research</w:t>
-      </w:r>
-    </w:p>
-    <w:bookmarkStart w:id="44" w:name="market-need"/>
-    <w:p>
-      <w:pPr>
-        <w:pStyle w:val="Heading3"/>
-      </w:pPr>
-      <w:r>
-        <w:t xml:space="preserve">Market need</w:t>
-      </w:r>
-    </w:p>
-    <w:p>
-      <w:pPr>
-        <w:pStyle w:val="FirstParagraph"/>
-      </w:pPr>
-      <w:r>
-        <w:t xml:space="preserve">India's platform and gig workforce is expanding while underwriting processes remain primarily designed around formal salary employment. NITI Aayog estimated approximately</w:t>
-      </w:r>
-      <w:r>
-        <w:t xml:space="preserve"> </w:t>
-      </w:r>
-      <w:r>
-        <w:rPr>
-          <w:b/>
-          <w:bCs/>
-        </w:rPr>
-        <w:t xml:space="preserve">7.7 million gig workers in 2020–21</w:t>
-      </w:r>
-      <w:r>
-        <w:t xml:space="preserve"> </w:t>
-      </w:r>
-      <w:r>
-        <w:t xml:space="preserve">and projected that the workforce could reach</w:t>
-      </w:r>
-      <w:r>
-        <w:t xml:space="preserve"> </w:t>
-      </w:r>
-      <w:r>
-        <w:rPr>
-          <w:b/>
-          <w:bCs/>
-        </w:rPr>
-        <w:t xml:space="preserve">23.5 million by 2029–30</w:t>
-      </w:r>
-      <w:r>
-        <w:t xml:space="preserve">. This growth creates a large population whose work is digitally recorded but whose income may not fit conventional documentation.</w:t>
-      </w:r>
-    </w:p>
-    <w:p>
-      <w:pPr>
-        <w:pStyle w:val="BodyText"/>
-      </w:pPr>
-      <w:r>
-        <w:t xml:space="preserve">At the same time, bank-account and digital-payment adoption has increased the amount of consentable cash-flow evidence available for analysis. India's Account Aggregator framework also provides a regulated direction for consent-based financial-data sharing. These developments make cash-flow underwriting more practical than it was when credit assessment depended mainly on paper salary records and prior loans.</w:t>
-      </w:r>
-    </w:p>
-    <w:bookmarkEnd w:id="44"/>
-    <w:bookmarkStart w:id="45" w:name="target-customers"/>
-    <w:p>
-      <w:pPr>
-        <w:pStyle w:val="Heading3"/>
-      </w:pPr>
-      <w:r>
-        <w:t xml:space="preserve">Target customers</w:t>
-      </w:r>
-    </w:p>
-    <w:p>
-      <w:pPr>
-        <w:pStyle w:val="FirstParagraph"/>
-      </w:pPr>
-      <w:r>
-        <w:t xml:space="preserve">The initial business-to-business customers are:</w:t>
-      </w:r>
-    </w:p>
-    <w:p>
-      <w:pPr>
-        <w:pStyle w:val="Compact"/>
-        <w:numPr>
-          <w:ilvl w:val="0"/>
-          <w:numId w:val="1007"/>
-        </w:numPr>
-      </w:pPr>
-      <w:r>
-        <w:t xml:space="preserve">NBFCs and digital lenders serving self-employed or new-to-credit applicants</w:t>
-      </w:r>
-    </w:p>
-    <w:p>
-      <w:pPr>
-        <w:pStyle w:val="Compact"/>
-        <w:numPr>
-          <w:ilvl w:val="0"/>
-          <w:numId w:val="1007"/>
-        </w:numPr>
-      </w:pPr>
-      <w:r>
-        <w:t xml:space="preserve">Banks developing small-ticket personal or productive-asset loans</w:t>
-      </w:r>
-    </w:p>
-    <w:p>
-      <w:pPr>
-        <w:pStyle w:val="Compact"/>
-        <w:numPr>
-          <w:ilvl w:val="0"/>
-          <w:numId w:val="1007"/>
-        </w:numPr>
-      </w:pPr>
-      <w:r>
-        <w:t xml:space="preserve">Gig platforms offering worker benefits or embedded financial products</w:t>
-      </w:r>
-    </w:p>
-    <w:p>
-      <w:pPr>
-        <w:pStyle w:val="Compact"/>
-        <w:numPr>
-          <w:ilvl w:val="0"/>
-          <w:numId w:val="1007"/>
-        </w:numPr>
-      </w:pPr>
-      <w:r>
-        <w:t xml:space="preserve">FinTech infrastructure providers that want an explainable gig-income assessment module</w:t>
-      </w:r>
-    </w:p>
-    <w:p>
-      <w:pPr>
-        <w:pStyle w:val="Compact"/>
-        <w:numPr>
-          <w:ilvl w:val="0"/>
-          <w:numId w:val="1007"/>
-        </w:numPr>
-      </w:pPr>
-      <w:r>
-        <w:t xml:space="preserve">Cooperatives and financial-inclusion programs evaluating non-salaried borrowers</w:t>
-      </w:r>
-    </w:p>
-    <w:bookmarkEnd w:id="45"/>
-    <w:bookmarkStart w:id="46" w:name="competitive-landscape"/>
-    <w:p>
-      <w:pPr>
-        <w:pStyle w:val="Heading3"/>
-      </w:pPr>
-      <w:r>
-        <w:t xml:space="preserve">Competitive landscape</w:t>
-      </w:r>
-    </w:p>
-    <w:tbl>
-      <w:tblPr>
-        <w:tblStyle w:val="Table"/>
-        <w:tblW w:type="auto" w:w="0"/>
-        <w:jc w:val="left"/>
-        <w:tblLook w:firstRow="1" w:lastRow="0" w:firstColumn="0" w:lastColumn="0" w:noHBand="0" w:noVBand="0" w:val="0020"/>
-      </w:tblPr>
-      <w:tblGrid>
-        <w:gridCol w:w="2640"/>
-        <w:gridCol w:w="2640"/>
-        <w:gridCol w:w="2640"/>
-      </w:tblGrid>
-      <w:tr>
-        <w:trPr>
-          <w:tblHeader w:val="on"/>
-        </w:trPr>
-        <w:tc>
-          <w:tcPr/>
-          <w:p>
-            <w:pPr>
-              <w:pStyle w:val="Compact"/>
-              <w:jc w:val="left"/>
-            </w:pPr>
-            <w:r>
-              <w:t xml:space="preserve">Category</w:t>
-            </w:r>
-          </w:p>
-        </w:tc>
-        <w:tc>
-          <w:tcPr/>
-          <w:p>
-            <w:pPr>
-              <w:pStyle w:val="Compact"/>
-              <w:jc w:val="left"/>
-            </w:pPr>
-            <w:r>
-              <w:t xml:space="preserve">Typical strength</w:t>
-            </w:r>
-          </w:p>
-        </w:tc>
-        <w:tc>
-          <w:tcPr/>
-          <w:p>
-            <w:pPr>
-              <w:pStyle w:val="Compact"/>
-              <w:jc w:val="left"/>
-            </w:pPr>
-            <w:r>
-              <w:t xml:space="preserve">Gap EarnScore addresses</w:t>
-            </w:r>
-          </w:p>
-        </w:tc>
-      </w:tr>
-      <w:tr>
-        <w:tc>
-          <w:tcPr/>
-          <w:p>
-            <w:pPr>
-              <w:pStyle w:val="Compact"/>
-              <w:jc w:val="left"/>
-            </w:pPr>
-            <w:r>
-              <w:t xml:space="preserve">Traditional credit bureaus</w:t>
-            </w:r>
-          </w:p>
-        </w:tc>
-        <w:tc>
-          <w:tcPr/>
-          <w:p>
-            <w:pPr>
-              <w:pStyle w:val="Compact"/>
-              <w:jc w:val="left"/>
-            </w:pPr>
-            <w:r>
-              <w:t xml:space="preserve">Established repayment-history data and lender acceptance</w:t>
-            </w:r>
-          </w:p>
-        </w:tc>
-        <w:tc>
-          <w:tcPr/>
-          <w:p>
-            <w:pPr>
-              <w:pStyle w:val="Compact"/>
-              <w:jc w:val="left"/>
-            </w:pPr>
-            <w:r>
-              <w:t xml:space="preserve">Limited evidence for people with little or no formal borrowing history</w:t>
-            </w:r>
-          </w:p>
-        </w:tc>
-      </w:tr>
-      <w:tr>
-        <w:tc>
-          <w:tcPr/>
-          <w:p>
-            <w:pPr>
-              <w:pStyle w:val="Compact"/>
-              <w:jc w:val="left"/>
-            </w:pPr>
-            <w:r>
-              <w:t xml:space="preserve">Bank-statement analytics providers</w:t>
-            </w:r>
-          </w:p>
-        </w:tc>
-        <w:tc>
-          <w:tcPr/>
-          <w:p>
-            <w:pPr>
-              <w:pStyle w:val="Compact"/>
-              <w:jc w:val="left"/>
-            </w:pPr>
-            <w:r>
-              <w:t xml:space="preserve">Transaction categorization and financial ratios</w:t>
-            </w:r>
-          </w:p>
-        </w:tc>
-        <w:tc>
-          <w:tcPr/>
-          <w:p>
-            <w:pPr>
-              <w:pStyle w:val="Compact"/>
-              <w:jc w:val="left"/>
-            </w:pPr>
-            <w:r>
-              <w:t xml:space="preserve">May provide analytics without a gig-worker-specific, judgeable earning-resilience narrative</w:t>
-            </w:r>
-          </w:p>
-        </w:tc>
-      </w:tr>
-      <w:tr>
-        <w:tc>
-          <w:tcPr/>
-          <w:p>
-            <w:pPr>
-              <w:pStyle w:val="Compact"/>
-              <w:jc w:val="left"/>
-            </w:pPr>
-            <w:r>
-              <w:t xml:space="preserve">Alternative-data scoring companies</w:t>
-            </w:r>
-          </w:p>
-        </w:tc>
-        <w:tc>
-          <w:tcPr/>
-          <w:p>
-            <w:pPr>
-              <w:pStyle w:val="Compact"/>
-              <w:jc w:val="left"/>
-            </w:pPr>
-            <w:r>
-              <w:t xml:space="preserve">Broader digital signals and automated risk models</w:t>
-            </w:r>
-          </w:p>
-        </w:tc>
-        <w:tc>
-          <w:tcPr/>
-          <w:p>
-            <w:pPr>
-              <w:pStyle w:val="Compact"/>
-              <w:jc w:val="left"/>
-            </w:pPr>
-            <w:r>
-              <w:t xml:space="preserve">Can be difficult for applicants or reviewers to interpret; some signals may raise privacy concerns</w:t>
-            </w:r>
-          </w:p>
-        </w:tc>
-      </w:tr>
-      <w:tr>
-        <w:tc>
-          <w:tcPr/>
-          <w:p>
-            <w:pPr>
-              <w:pStyle w:val="Compact"/>
-              <w:jc w:val="left"/>
-            </w:pPr>
-            <w:r>
-              <w:t xml:space="preserve">Lender-specific underwriting models</w:t>
-            </w:r>
-          </w:p>
-        </w:tc>
-        <w:tc>
-          <w:tcPr/>
-          <w:p>
-            <w:pPr>
-              <w:pStyle w:val="Compact"/>
-              <w:jc w:val="left"/>
-            </w:pPr>
-            <w:r>
-              <w:t xml:space="preserve">Optimized for one lender's portfolio</w:t>
-            </w:r>
-          </w:p>
-        </w:tc>
-        <w:tc>
-          <w:tcPr/>
-          <w:p>
-            <w:pPr>
-              <w:pStyle w:val="Compact"/>
-              <w:jc w:val="left"/>
-            </w:pPr>
-            <w:r>
-              <w:t xml:space="preserve">Often difficult to reuse across institutions and may remain hidden from front-line reviewers</w:t>
-            </w:r>
-          </w:p>
-        </w:tc>
-      </w:tr>
-      <w:tr>
-        <w:tc>
-          <w:tcPr/>
-          <w:p>
-            <w:pPr>
-              <w:pStyle w:val="Compact"/>
-              <w:jc w:val="left"/>
-            </w:pPr>
-            <w:r>
-              <w:t xml:space="preserve">EarnScore</w:t>
-            </w:r>
-          </w:p>
-        </w:tc>
-        <w:tc>
-          <w:tcPr/>
-          <w:p>
-            <w:pPr>
-              <w:pStyle w:val="Compact"/>
-              <w:jc w:val="left"/>
-            </w:pPr>
-            <w:r>
-              <w:t xml:space="preserve">Gig-income consolidation, confidence separation, evidence-backed explanations, and human review</w:t>
-            </w:r>
-          </w:p>
-        </w:tc>
-        <w:tc>
-          <w:tcPr/>
-          <w:p>
-            <w:pPr>
-              <w:pStyle w:val="Compact"/>
-              <w:jc w:val="left"/>
-            </w:pPr>
-            <w:r>
-              <w:t xml:space="preserve">Requires outcome-data calibration and integrations before production lending use</w:t>
-            </w:r>
-          </w:p>
-        </w:tc>
-      </w:tr>
-    </w:tbl>
-    <w:bookmarkEnd w:id="46"/>
-    <w:bookmarkStart w:id="47" w:name="positioning"/>
-    <w:p>
-      <w:pPr>
-        <w:pStyle w:val="Heading3"/>
-      </w:pPr>
-      <w:r>
-        <w:t xml:space="preserve">Positioning</w:t>
-      </w:r>
-    </w:p>
-    <w:p>
-      <w:pPr>
-        <w:pStyle w:val="FirstParagraph"/>
-      </w:pPr>
-      <w:r>
-        <w:t xml:space="preserve">EarnScore should initially be positioned as an</w:t>
-      </w:r>
-      <w:r>
-        <w:t xml:space="preserve"> </w:t>
-      </w:r>
-      <w:r>
-        <w:rPr>
-          <w:b/>
-          <w:bCs/>
-        </w:rPr>
-        <w:t xml:space="preserve">underwriting intelligence layer</w:t>
-      </w:r>
-      <w:r>
-        <w:t xml:space="preserve">, not as a lender or replacement for a credit bureau. It complements bureau history with current cash-flow evidence and gives analysts a consistent way to review non-salaried applicants.</w:t>
-      </w:r>
-    </w:p>
-    <w:bookmarkEnd w:id="47"/>
-    <w:bookmarkStart w:id="48" w:name="business-model"/>
-    <w:p>
-      <w:pPr>
-        <w:pStyle w:val="Heading3"/>
-      </w:pPr>
-      <w:r>
-        <w:t xml:space="preserve">Business model</w:t>
-      </w:r>
-    </w:p>
-    <w:p>
-      <w:pPr>
-        <w:pStyle w:val="FirstParagraph"/>
-      </w:pPr>
-      <w:r>
-        <w:t xml:space="preserve">A production version could use a tiered B2B model:</w:t>
-      </w:r>
-    </w:p>
-    <w:p>
-      <w:pPr>
-        <w:pStyle w:val="Compact"/>
-        <w:numPr>
-          <w:ilvl w:val="0"/>
-          <w:numId w:val="1008"/>
-        </w:numPr>
-      </w:pPr>
-      <w:r>
-        <w:t xml:space="preserve">API fee per completed applicant analysis</w:t>
-      </w:r>
-    </w:p>
-    <w:p>
-      <w:pPr>
-        <w:pStyle w:val="Compact"/>
-        <w:numPr>
-          <w:ilvl w:val="0"/>
-          <w:numId w:val="1008"/>
-        </w:numPr>
-      </w:pPr>
-      <w:r>
-        <w:t xml:space="preserve">Monthly subscription for lender dashboard users</w:t>
-      </w:r>
-    </w:p>
-    <w:p>
-      <w:pPr>
-        <w:pStyle w:val="Compact"/>
-        <w:numPr>
-          <w:ilvl w:val="0"/>
-          <w:numId w:val="1008"/>
-        </w:numPr>
-      </w:pPr>
-      <w:r>
-        <w:t xml:space="preserve">Enterprise pricing for private deployment, custom policy rules, monitoring, and audit support</w:t>
-      </w:r>
-    </w:p>
-    <w:p>
-      <w:pPr>
-        <w:pStyle w:val="Compact"/>
-        <w:numPr>
-          <w:ilvl w:val="0"/>
-          <w:numId w:val="1008"/>
-        </w:numPr>
-      </w:pPr>
-      <w:r>
-        <w:t xml:space="preserve">Platform partnerships for embedded worker financial-wellness or credit-readiness tools</w:t>
-      </w:r>
-    </w:p>
-    <w:bookmarkEnd w:id="48"/>
-    <w:bookmarkStart w:id="49" w:name="go-to-market-sequence"/>
-    <w:p>
-      <w:pPr>
-        <w:pStyle w:val="Heading3"/>
-      </w:pPr>
-      <w:r>
-        <w:t xml:space="preserve">Go-to-market sequence</w:t>
-      </w:r>
-    </w:p>
-    <w:p>
-      <w:pPr>
-        <w:pStyle w:val="Compact"/>
-        <w:numPr>
-          <w:ilvl w:val="0"/>
-          <w:numId w:val="1009"/>
-        </w:numPr>
-      </w:pPr>
-      <w:r>
-        <w:t xml:space="preserve">Pilot with one lender or gig platform using historical, consented, de-identified data.</w:t>
-      </w:r>
-    </w:p>
-    <w:p>
-      <w:pPr>
-        <w:pStyle w:val="Compact"/>
-        <w:numPr>
-          <w:ilvl w:val="0"/>
-          <w:numId w:val="1009"/>
-        </w:numPr>
-      </w:pPr>
-      <w:r>
-        <w:t xml:space="preserve">Validate whether EarnScore features improve review coverage and decision consistency.</w:t>
-      </w:r>
-    </w:p>
-    <w:p>
-      <w:pPr>
-        <w:pStyle w:val="Compact"/>
-        <w:numPr>
-          <w:ilvl w:val="0"/>
-          <w:numId w:val="1009"/>
-        </w:numPr>
-      </w:pPr>
-      <w:r>
-        <w:t xml:space="preserve">Calibrate against repayment outcomes without removing explainability.</w:t>
-      </w:r>
-    </w:p>
-    <w:p>
-      <w:pPr>
-        <w:pStyle w:val="Compact"/>
-        <w:numPr>
-          <w:ilvl w:val="0"/>
-          <w:numId w:val="1009"/>
-        </w:numPr>
-      </w:pPr>
-      <w:r>
-        <w:t xml:space="preserve">Run fairness, stability, privacy, and regulatory assessments.</w:t>
-      </w:r>
-    </w:p>
-    <w:p>
-      <w:pPr>
-        <w:pStyle w:val="Compact"/>
-        <w:numPr>
-          <w:ilvl w:val="0"/>
-          <w:numId w:val="1009"/>
-        </w:numPr>
-      </w:pPr>
-      <w:r>
-        <w:t xml:space="preserve">Launch as a decision-support API and dashboard for a narrowly defined credit product.</w:t>
-      </w:r>
-    </w:p>
-    <w:bookmarkEnd w:id="49"/>
-    <w:bookmarkStart w:id="54" w:name="research-references"/>
-    <w:p>
-      <w:pPr>
-        <w:pStyle w:val="Heading3"/>
-      </w:pPr>
-      <w:r>
         <w:t xml:space="preserve">Research references</w:t>
       </w:r>
     </w:p>
@@ -2239,7 +2560,7 @@
         <w:pStyle w:val="Compact"/>
         <w:numPr>
           <w:ilvl w:val="0"/>
-          <w:numId w:val="1010"/>
+          <w:numId w:val="1012"/>
         </w:numPr>
       </w:pPr>
       <w:r>
@@ -2264,7 +2585,7 @@
       <w:r>
         <w:br/>
       </w:r>
-      <w:hyperlink r:id="rId50">
+      <w:hyperlink r:id="rId51">
         <w:r>
           <w:rPr>
             <w:rStyle w:val="Hyperlink"/>
@@ -2278,7 +2599,7 @@
         <w:pStyle w:val="Compact"/>
         <w:numPr>
           <w:ilvl w:val="0"/>
-          <w:numId w:val="1010"/>
+          <w:numId w:val="1012"/>
         </w:numPr>
       </w:pPr>
       <w:r>
@@ -2287,7 +2608,7 @@
       <w:r>
         <w:br/>
       </w:r>
-      <w:hyperlink r:id="rId51">
+      <w:hyperlink r:id="rId52">
         <w:r>
           <w:rPr>
             <w:rStyle w:val="Hyperlink"/>
@@ -2301,7 +2622,7 @@
         <w:pStyle w:val="Compact"/>
         <w:numPr>
           <w:ilvl w:val="0"/>
-          <w:numId w:val="1010"/>
+          <w:numId w:val="1012"/>
         </w:numPr>
       </w:pPr>
       <w:r>
@@ -2323,7 +2644,7 @@
       <w:r>
         <w:br/>
       </w:r>
-      <w:hyperlink r:id="rId52">
+      <w:hyperlink r:id="rId53">
         <w:r>
           <w:rPr>
             <w:rStyle w:val="Hyperlink"/>
@@ -2337,7 +2658,7 @@
         <w:pStyle w:val="Compact"/>
         <w:numPr>
           <w:ilvl w:val="0"/>
-          <w:numId w:val="1010"/>
+          <w:numId w:val="1012"/>
         </w:numPr>
       </w:pPr>
       <w:r>
@@ -2359,7 +2680,7 @@
       <w:r>
         <w:br/>
       </w:r>
-      <w:hyperlink r:id="rId53">
+      <w:hyperlink r:id="rId54">
         <w:r>
           <w:rPr>
             <w:rStyle w:val="Hyperlink"/>
@@ -2376,9 +2697,9 @@
         <w:t xml:space="preserve">The market figures above should be rechecked against the linked primary publications before external submission or publication. The hackathon MVP does not claim proprietary market validation or a production-ready risk model.</w:t>
       </w:r>
     </w:p>
-    <w:bookmarkEnd w:id="54"/>
     <w:bookmarkEnd w:id="55"/>
-    <w:bookmarkStart w:id="61" w:name="X93f250b8ac88c814716b20b105a72b2462a046b"/>
+    <w:bookmarkEnd w:id="56"/>
+    <w:bookmarkStart w:id="62" w:name="X93f250b8ac88c814716b20b105a72b2462a046b"/>
     <w:p>
       <w:pPr>
         <w:pStyle w:val="Heading2"/>
@@ -2387,7 +2708,7 @@
         <w:t xml:space="preserve">7. Impact</w:t>
       </w:r>
     </w:p>
-    <w:bookmarkStart w:id="56" w:name="impact-on-workers"/>
+    <w:bookmarkStart w:id="57" w:name="impact-on-workers"/>
     <w:p>
       <w:pPr>
         <w:pStyle w:val="Heading3"/>
@@ -2401,7 +2722,7 @@
         <w:pStyle w:val="Compact"/>
         <w:numPr>
           <w:ilvl w:val="0"/>
-          <w:numId w:val="1011"/>
+          <w:numId w:val="1013"/>
         </w:numPr>
       </w:pPr>
       <w:r>
@@ -2413,7 +2734,7 @@
         <w:pStyle w:val="Compact"/>
         <w:numPr>
           <w:ilvl w:val="0"/>
-          <w:numId w:val="1011"/>
+          <w:numId w:val="1013"/>
         </w:numPr>
       </w:pPr>
       <w:r>
@@ -2425,7 +2746,7 @@
         <w:pStyle w:val="Compact"/>
         <w:numPr>
           <w:ilvl w:val="0"/>
-          <w:numId w:val="1011"/>
+          <w:numId w:val="1013"/>
         </w:numPr>
       </w:pPr>
       <w:r>
@@ -2437,15 +2758,15 @@
         <w:pStyle w:val="Compact"/>
         <w:numPr>
           <w:ilvl w:val="0"/>
-          <w:numId w:val="1011"/>
+          <w:numId w:val="1013"/>
         </w:numPr>
       </w:pPr>
       <w:r>
         <w:t xml:space="preserve">Can support access to emergency credit, productive assets, education, insurance, and income-smoothing products.</w:t>
       </w:r>
     </w:p>
-    <w:bookmarkEnd w:id="56"/>
-    <w:bookmarkStart w:id="57" w:name="impact-on-lenders"/>
+    <w:bookmarkEnd w:id="57"/>
+    <w:bookmarkStart w:id="58" w:name="impact-on-lenders"/>
     <w:p>
       <w:pPr>
         <w:pStyle w:val="Heading3"/>
@@ -2459,7 +2780,7 @@
         <w:pStyle w:val="Compact"/>
         <w:numPr>
           <w:ilvl w:val="0"/>
-          <w:numId w:val="1012"/>
+          <w:numId w:val="1014"/>
         </w:numPr>
       </w:pPr>
       <w:r>
@@ -2471,7 +2792,7 @@
         <w:pStyle w:val="Compact"/>
         <w:numPr>
           <w:ilvl w:val="0"/>
-          <w:numId w:val="1012"/>
+          <w:numId w:val="1014"/>
         </w:numPr>
       </w:pPr>
       <w:r>
@@ -2483,7 +2804,7 @@
         <w:pStyle w:val="Compact"/>
         <w:numPr>
           <w:ilvl w:val="0"/>
-          <w:numId w:val="1012"/>
+          <w:numId w:val="1014"/>
         </w:numPr>
       </w:pPr>
       <w:r>
@@ -2495,15 +2816,15 @@
         <w:pStyle w:val="Compact"/>
         <w:numPr>
           <w:ilvl w:val="0"/>
-          <w:numId w:val="1012"/>
+          <w:numId w:val="1014"/>
         </w:numPr>
       </w:pPr>
       <w:r>
         <w:t xml:space="preserve">Creates an auditable record that can support model governance and customer communication.</w:t>
       </w:r>
     </w:p>
-    <w:bookmarkEnd w:id="57"/>
-    <w:bookmarkStart w:id="58" w:name="wider-economic-and-social-impact"/>
+    <w:bookmarkEnd w:id="58"/>
+    <w:bookmarkStart w:id="59" w:name="wider-economic-and-social-impact"/>
     <w:p>
       <w:pPr>
         <w:pStyle w:val="Heading3"/>
@@ -2517,7 +2838,7 @@
         <w:pStyle w:val="Compact"/>
         <w:numPr>
           <w:ilvl w:val="0"/>
-          <w:numId w:val="1013"/>
+          <w:numId w:val="1015"/>
         </w:numPr>
       </w:pPr>
       <w:r>
@@ -2529,7 +2850,7 @@
         <w:pStyle w:val="Compact"/>
         <w:numPr>
           <w:ilvl w:val="0"/>
-          <w:numId w:val="1013"/>
+          <w:numId w:val="1015"/>
         </w:numPr>
       </w:pPr>
       <w:r>
@@ -2541,7 +2862,7 @@
         <w:pStyle w:val="Compact"/>
         <w:numPr>
           <w:ilvl w:val="0"/>
-          <w:numId w:val="1013"/>
+          <w:numId w:val="1015"/>
         </w:numPr>
       </w:pPr>
       <w:r>
@@ -2553,15 +2874,15 @@
         <w:pStyle w:val="Compact"/>
         <w:numPr>
           <w:ilvl w:val="0"/>
-          <w:numId w:val="1013"/>
+          <w:numId w:val="1015"/>
         </w:numPr>
       </w:pPr>
       <w:r>
         <w:t xml:space="preserve">Can enable more suitable small-ticket credit products for variable-income households.</w:t>
       </w:r>
     </w:p>
-    <w:bookmarkEnd w:id="58"/>
-    <w:bookmarkStart w:id="59" w:name="impact-measurement"/>
+    <w:bookmarkEnd w:id="59"/>
+    <w:bookmarkStart w:id="60" w:name="impact-measurement"/>
     <w:p>
       <w:pPr>
         <w:pStyle w:val="Heading3"/>
@@ -2801,8 +3122,8 @@
         </w:tc>
       </w:tr>
     </w:tbl>
-    <w:bookmarkEnd w:id="59"/>
-    <w:bookmarkStart w:id="60" w:name="intended-outcome"/>
+    <w:bookmarkEnd w:id="60"/>
+    <w:bookmarkStart w:id="61" w:name="intended-outcome"/>
     <w:p>
       <w:pPr>
         <w:pStyle w:val="Heading3"/>
@@ -2826,9 +3147,9 @@
         </w:pict>
       </w:r>
     </w:p>
-    <w:bookmarkEnd w:id="60"/>
     <w:bookmarkEnd w:id="61"/>
-    <w:bookmarkStart w:id="62" w:name="hackathon-mvp-success-criteria"/>
+    <w:bookmarkEnd w:id="62"/>
+    <w:bookmarkStart w:id="63" w:name="hackathon-mvp-success-criteria"/>
     <w:p>
       <w:pPr>
         <w:pStyle w:val="Heading2"/>
@@ -2850,7 +3171,7 @@
         <w:pStyle w:val="Compact"/>
         <w:numPr>
           <w:ilvl w:val="0"/>
-          <w:numId w:val="1014"/>
+          <w:numId w:val="1016"/>
         </w:numPr>
       </w:pPr>
       <w:r>
@@ -2862,7 +3183,7 @@
         <w:pStyle w:val="Compact"/>
         <w:numPr>
           <w:ilvl w:val="0"/>
-          <w:numId w:val="1014"/>
+          <w:numId w:val="1016"/>
         </w:numPr>
       </w:pPr>
       <w:r>
@@ -2874,7 +3195,7 @@
         <w:pStyle w:val="Compact"/>
         <w:numPr>
           <w:ilvl w:val="0"/>
-          <w:numId w:val="1014"/>
+          <w:numId w:val="1016"/>
         </w:numPr>
       </w:pPr>
       <w:r>
@@ -2886,7 +3207,7 @@
         <w:pStyle w:val="Compact"/>
         <w:numPr>
           <w:ilvl w:val="0"/>
-          <w:numId w:val="1014"/>
+          <w:numId w:val="1016"/>
         </w:numPr>
       </w:pPr>
       <w:r>
@@ -2898,7 +3219,7 @@
         <w:pStyle w:val="Compact"/>
         <w:numPr>
           <w:ilvl w:val="0"/>
-          <w:numId w:val="1014"/>
+          <w:numId w:val="1016"/>
         </w:numPr>
       </w:pPr>
       <w:r>
@@ -2910,15 +3231,15 @@
         <w:pStyle w:val="Compact"/>
         <w:numPr>
           <w:ilvl w:val="0"/>
-          <w:numId w:val="1014"/>
+          <w:numId w:val="1016"/>
         </w:numPr>
       </w:pPr>
       <w:r>
         <w:t xml:space="preserve">The lender makes and records the final decision.</w:t>
       </w:r>
     </w:p>
-    <w:bookmarkEnd w:id="62"/>
     <w:bookmarkEnd w:id="63"/>
+    <w:bookmarkEnd w:id="64"/>
     <w:sectPr/>
   </w:body>
 </w:document>
@@ -3025,6 +3346,82 @@
       </w:pPr>
     </w:lvl>
   </w:abstractNum>
+  <w:abstractNum w:abstractNumId="991">
+    <w:nsid w:val="0000A991"/>
+    <w:multiLevelType w:val="multilevel"/>
+    <w:lvl w:ilvl="0">
+      <w:numFmt w:val="bullet"/>
+      <w:lvlText w:val="•"/>
+      <w:lvlJc w:val="left"/>
+      <w:pPr>
+        <w:ind w:left="720" w:hanging="480"/>
+      </w:pPr>
+    </w:lvl>
+    <w:lvl w:ilvl="1">
+      <w:numFmt w:val="bullet"/>
+      <w:lvlText w:val="–"/>
+      <w:lvlJc w:val="left"/>
+      <w:pPr>
+        <w:ind w:left="1440" w:hanging="480"/>
+      </w:pPr>
+    </w:lvl>
+    <w:lvl w:ilvl="2">
+      <w:numFmt w:val="bullet"/>
+      <w:lvlText w:val="•"/>
+      <w:lvlJc w:val="left"/>
+      <w:pPr>
+        <w:ind w:left="2160" w:hanging="480"/>
+      </w:pPr>
+    </w:lvl>
+    <w:lvl w:ilvl="3">
+      <w:numFmt w:val="bullet"/>
+      <w:lvlText w:val="–"/>
+      <w:lvlJc w:val="left"/>
+      <w:pPr>
+        <w:ind w:left="2880" w:hanging="480"/>
+      </w:pPr>
+    </w:lvl>
+    <w:lvl w:ilvl="4">
+      <w:numFmt w:val="bullet"/>
+      <w:lvlText w:val="•"/>
+      <w:lvlJc w:val="left"/>
+      <w:pPr>
+        <w:ind w:left="3600" w:hanging="480"/>
+      </w:pPr>
+    </w:lvl>
+    <w:lvl w:ilvl="5">
+      <w:numFmt w:val="bullet"/>
+      <w:lvlText w:val="–"/>
+      <w:lvlJc w:val="left"/>
+      <w:pPr>
+        <w:ind w:left="4320" w:hanging="480"/>
+      </w:pPr>
+    </w:lvl>
+    <w:lvl w:ilvl="6">
+      <w:numFmt w:val="bullet"/>
+      <w:lvlText w:val="•"/>
+      <w:lvlJc w:val="left"/>
+      <w:pPr>
+        <w:ind w:left="5040" w:hanging="480"/>
+      </w:pPr>
+    </w:lvl>
+    <w:lvl w:ilvl="7">
+      <w:numFmt w:val="bullet"/>
+      <w:lvlText w:val="–"/>
+      <w:lvlJc w:val="left"/>
+      <w:pPr>
+        <w:ind w:left="5760" w:hanging="480"/>
+      </w:pPr>
+    </w:lvl>
+    <w:lvl w:ilvl="8">
+      <w:numFmt w:val="bullet"/>
+      <w:lvlText w:val="•"/>
+      <w:lvlJc w:val="left"/>
+      <w:pPr>
+        <w:ind w:left="6480" w:hanging="480"/>
+      </w:pPr>
+    </w:lvl>
+  </w:abstractNum>
   <w:abstractNum w:abstractNumId="99411">
     <w:nsid w:val="00A99411"/>
     <w:multiLevelType w:val="multilevel"/>
@@ -3110,86 +3507,13 @@
       </w:pPr>
     </w:lvl>
   </w:abstractNum>
-  <w:abstractNum w:abstractNumId="991">
-    <w:nsid w:val="0000A991"/>
-    <w:multiLevelType w:val="multilevel"/>
-    <w:lvl w:ilvl="0">
-      <w:numFmt w:val="bullet"/>
-      <w:lvlText w:val="•"/>
-      <w:lvlJc w:val="left"/>
-      <w:pPr>
-        <w:ind w:left="720" w:hanging="480"/>
-      </w:pPr>
-    </w:lvl>
-    <w:lvl w:ilvl="1">
-      <w:numFmt w:val="bullet"/>
-      <w:lvlText w:val="–"/>
-      <w:lvlJc w:val="left"/>
-      <w:pPr>
-        <w:ind w:left="1440" w:hanging="480"/>
-      </w:pPr>
-    </w:lvl>
-    <w:lvl w:ilvl="2">
-      <w:numFmt w:val="bullet"/>
-      <w:lvlText w:val="•"/>
-      <w:lvlJc w:val="left"/>
-      <w:pPr>
-        <w:ind w:left="2160" w:hanging="480"/>
-      </w:pPr>
-    </w:lvl>
-    <w:lvl w:ilvl="3">
-      <w:numFmt w:val="bullet"/>
-      <w:lvlText w:val="–"/>
-      <w:lvlJc w:val="left"/>
-      <w:pPr>
-        <w:ind w:left="2880" w:hanging="480"/>
-      </w:pPr>
-    </w:lvl>
-    <w:lvl w:ilvl="4">
-      <w:numFmt w:val="bullet"/>
-      <w:lvlText w:val="•"/>
-      <w:lvlJc w:val="left"/>
-      <w:pPr>
-        <w:ind w:left="3600" w:hanging="480"/>
-      </w:pPr>
-    </w:lvl>
-    <w:lvl w:ilvl="5">
-      <w:numFmt w:val="bullet"/>
-      <w:lvlText w:val="–"/>
-      <w:lvlJc w:val="left"/>
-      <w:pPr>
-        <w:ind w:left="4320" w:hanging="480"/>
-      </w:pPr>
-    </w:lvl>
-    <w:lvl w:ilvl="6">
-      <w:numFmt w:val="bullet"/>
-      <w:lvlText w:val="•"/>
-      <w:lvlJc w:val="left"/>
-      <w:pPr>
-        <w:ind w:left="5040" w:hanging="480"/>
-      </w:pPr>
-    </w:lvl>
-    <w:lvl w:ilvl="7">
-      <w:numFmt w:val="bullet"/>
-      <w:lvlText w:val="–"/>
-      <w:lvlJc w:val="left"/>
-      <w:pPr>
-        <w:ind w:left="5760" w:hanging="480"/>
-      </w:pPr>
-    </w:lvl>
-    <w:lvl w:ilvl="8">
-      <w:numFmt w:val="bullet"/>
-      <w:lvlText w:val="•"/>
-      <w:lvlJc w:val="left"/>
-      <w:pPr>
-        <w:ind w:left="6480" w:hanging="480"/>
-      </w:pPr>
-    </w:lvl>
-  </w:abstractNum>
   <w:num w:numId="1000">
     <w:abstractNumId w:val="990"/>
   </w:num>
   <w:num w:numId="1001">
+    <w:abstractNumId w:val="991"/>
+  </w:num>
+  <w:num w:numId="1002">
     <w:abstractNumId w:val="99411"/>
     <w:lvlOverride w:ilvl="0">
       <w:startOverride w:val="1"/>
@@ -3219,9 +3543,6 @@
       <w:startOverride w:val="1"/>
     </w:lvlOverride>
   </w:num>
-  <w:num w:numId="1002">
-    <w:abstractNumId w:val="991"/>
-  </w:num>
   <w:num w:numId="1003">
     <w:abstractNumId w:val="991"/>
   </w:num>
@@ -3241,6 +3562,12 @@
     <w:abstractNumId w:val="991"/>
   </w:num>
   <w:num w:numId="1009">
+    <w:abstractNumId w:val="991"/>
+  </w:num>
+  <w:num w:numId="1010">
+    <w:abstractNumId w:val="991"/>
+  </w:num>
+  <w:num w:numId="1011">
     <w:abstractNumId w:val="99411"/>
     <w:lvlOverride w:ilvl="0">
       <w:startOverride w:val="1"/>
@@ -3270,7 +3597,7 @@
       <w:startOverride w:val="1"/>
     </w:lvlOverride>
   </w:num>
-  <w:num w:numId="1010">
+  <w:num w:numId="1012">
     <w:abstractNumId w:val="99411"/>
     <w:lvlOverride w:ilvl="0">
       <w:startOverride w:val="1"/>
@@ -3300,16 +3627,16 @@
       <w:startOverride w:val="1"/>
     </w:lvlOverride>
   </w:num>
-  <w:num w:numId="1011">
-    <w:abstractNumId w:val="991"/>
-  </w:num>
-  <w:num w:numId="1012">
-    <w:abstractNumId w:val="991"/>
-  </w:num>
   <w:num w:numId="1013">
     <w:abstractNumId w:val="991"/>
   </w:num>
   <w:num w:numId="1014">
+    <w:abstractNumId w:val="991"/>
+  </w:num>
+  <w:num w:numId="1015">
+    <w:abstractNumId w:val="991"/>
+  </w:num>
+  <w:num w:numId="1016">
     <w:abstractNumId w:val="99411"/>
     <w:lvlOverride w:ilvl="0">
       <w:startOverride w:val="1"/>

</xml_diff>